<commit_message>
Booklet: title page and front matter
docs/booklet/front.md holds the title page (8 mark, title, promise,
version and date filled in at build time), About this booklet (who it's
for, how to read it, what you need, where to find more) and a Contents
page (a Word TOC field of the chapter titles). The template adds Cover
Mark/Title/Subtitle/Note and Front Heading styles, no header or footer on
the title page, and updateFields so Word fills in the contents on open.
The build reads pandoc markdown (fenced divs for the custom styles; curly
quotes too). Checked in Word: styles applied, 12 contents entries with
page numbers, 25 booklet pages.

Co-Authored-By: Claude Opus 5.5 <noreply@anthropic.com>
</commit_message>
<xml_diff>
--- a/docs/template/journey-reference.docx
+++ b/docs/template/journey-reference.docx
@@ -316,11 +316,14 @@
     <w:sectPr>
       <w:headerReference w:type="default" r:id="rIdHeader1"/>
       <w:footerReference w:type="default" r:id="rIdFooter1"/>
+      <w:headerReference w:type="first" r:id="rIdHeader2"/>
+      <w:footerReference w:type="first" r:id="rIdFooter2"/>
       <w:footnotePr>
         <w:numRestart w:val="eachSect"/>
       </w:footnotePr>
       <w:pgSz w:w="7920" w:h="12240" w:orient="landscape"/>
       <w:pgMar w:top="720" w:right="720" w:bottom="720" w:left="720" w:header="360" w:footer="360" w:gutter="0"/>
+      <w:titlePg/>
     </w:sectPr>
   </w:body>
 </w:document>
@@ -406,6 +409,12 @@
 </w:ftr>
 </file>
 
+<file path=word/footer2.xml><?xml version="1.0" encoding="utf-8"?>
+<w:ftr xmlns:w="http://schemas.openxmlformats.org/wordprocessingml/2006/main" xmlns:r="http://schemas.openxmlformats.org/officeDocument/2006/relationships" xmlns:wp="http://schemas.openxmlformats.org/drawingml/2006/wordprocessingDrawing" xmlns:a="http://schemas.openxmlformats.org/drawingml/2006/main" xmlns:pic="http://schemas.openxmlformats.org/drawingml/2006/picture">
+  <w:p/>
+</w:ftr>
+</file>
+
 <file path=word/footnotes.xml><?xml version="1.0" encoding="utf-8"?>
 <w:footnotes xmlns:w="http://schemas.openxmlformats.org/wordprocessingml/2006/main" xmlns:m="http://schemas.openxmlformats.org/officeDocument/2006/math" xmlns:r="http://schemas.openxmlformats.org/officeDocument/2006/relationships" xmlns:o="urn:schemas-microsoft-com:office:office" xmlns:v="urn:schemas-microsoft-com:vml" xmlns:w10="urn:schemas-microsoft-com:office:word" xmlns:a="http://schemas.openxmlformats.org/drawingml/2006/main" xmlns:pic="http://schemas.openxmlformats.org/drawingml/2006/picture" xmlns:wp="http://schemas.openxmlformats.org/drawingml/2006/wordprocessingDrawing">
   <w:footnote w:type="continuationSeparator" w:id="0">
@@ -505,6 +514,12 @@
 </w:hdr>
 </file>
 
+<file path=word/header2.xml><?xml version="1.0" encoding="utf-8"?>
+<w:hdr xmlns:w="http://schemas.openxmlformats.org/wordprocessingml/2006/main" xmlns:r="http://schemas.openxmlformats.org/officeDocument/2006/relationships" xmlns:wp="http://schemas.openxmlformats.org/drawingml/2006/wordprocessingDrawing" xmlns:a="http://schemas.openxmlformats.org/drawingml/2006/main" xmlns:pic="http://schemas.openxmlformats.org/drawingml/2006/picture">
+  <w:p/>
+</w:hdr>
+</file>
+
 <file path=word/numbering.xml><?xml version="1.0" encoding="utf-8"?>
 <w:numbering xmlns:w="http://schemas.openxmlformats.org/wordprocessingml/2006/main">
   <w:abstractNum w:abstractNumId="990">
@@ -1287,6 +1302,81 @@
       <w:b w:val="0"/>
       <w:bCs w:val="0"/>
       <w:color w:val="365F91" w:themeColor="accent1" w:themeShade="BF"/>
+    </w:rPr>
+  </w:style>
+  <w:style w:type="paragraph" w:customStyle="1" w:styleId="CoverMark">
+    <w:name w:val="Cover Mark"/>
+    <w:basedOn w:val="Normal"/>
+    <w:qFormat/>
+    <w:pPr>
+      <w:jc w:val="center"/>
+      <w:spacing w:before="2400" w:after="360"/>
+    </w:pPr>
+    <w:rPr/>
+  </w:style>
+  <w:style w:type="paragraph" w:customStyle="1" w:styleId="CoverTitle">
+    <w:name w:val="Cover Title"/>
+    <w:basedOn w:val="Normal"/>
+    <w:qFormat/>
+    <w:pPr>
+      <w:jc w:val="center"/>
+      <w:spacing w:after="240"/>
+    </w:pPr>
+    <w:rPr>
+      <w:rFonts w:ascii="Montserrat" w:hAnsi="Montserrat" w:eastAsia="Montserrat" w:cs="Montserrat"/>
+      <w:b/>
+      <w:bCs/>
+      <w:color w:val="1356CF"/>
+      <w:sz w:val="56"/>
+      <w:szCs w:val="56"/>
+    </w:rPr>
+  </w:style>
+  <w:style w:type="paragraph" w:customStyle="1" w:styleId="CoverSubtitle">
+    <w:name w:val="Cover Subtitle"/>
+    <w:basedOn w:val="Normal"/>
+    <w:qFormat/>
+    <w:pPr>
+      <w:jc w:val="center"/>
+      <w:spacing w:after="1440"/>
+    </w:pPr>
+    <w:rPr>
+      <w:color w:val="2B2B2B"/>
+      <w:sz w:val="24"/>
+      <w:szCs w:val="24"/>
+    </w:rPr>
+  </w:style>
+  <w:style w:type="paragraph" w:customStyle="1" w:styleId="CoverNote">
+    <w:name w:val="Cover Note"/>
+    <w:basedOn w:val="Normal"/>
+    <w:qFormat/>
+    <w:pPr>
+      <w:jc w:val="center"/>
+      <w:spacing w:after="60"/>
+    </w:pPr>
+    <w:rPr>
+      <w:color w:val="6C757D"/>
+      <w:sz w:val="17"/>
+      <w:szCs w:val="17"/>
+    </w:rPr>
+  </w:style>
+  <w:style w:type="paragraph" w:customStyle="1" w:styleId="FrontHeading">
+    <w:name w:val="Front Heading"/>
+    <w:basedOn w:val="Normal"/>
+    <w:qFormat/>
+    <w:pPr>
+      <w:keepNext/>
+      <w:spacing w:before="240" w:after="120"/>
+      <w:pBdr>
+        <w:bottom w:val="single" w:sz="8" w:space="4" w:color="1356CF"/>
+      </w:pBdr>
+    </w:pPr>
+    <w:rPr>
+      <w:rFonts w:ascii="Montserrat" w:hAnsi="Montserrat" w:eastAsia="Montserrat" w:cs="Montserrat"/>
+      <w:b/>
+      <w:bCs/>
+      <w:color w:val="1356CF"/>
+      <w:sz w:val="28"/>
+      <w:szCs w:val="28"/>
     </w:rPr>
   </w:style>
 </w:styles>

</xml_diff>

<commit_message>
Booklet template: real sample pages, and protect hand edits
The template's body is now a 4-page sample of the real booklet (title
page, About this booklet + Contents, the Trim It chapter), built with
build-docs-docx.mjs --sample, so it can be styled by hand against real
content. pandoc still uses only its styles, header, footer and page
setup. make-docx-template.mjs records a fingerprint of what it generated
and refuses to overwrite a hand-edited template unless --force.
build-docs-docx.mjs says plainly when the output is open in Word.

Co-Authored-By: Claude Opus 5.5 <noreply@anthropic.com>
</commit_message>
<xml_diff>
--- a/docs/template/journey-reference.docx
+++ b/docs/template/journey-reference.docx
@@ -4,270 +4,653 @@
   <w:body>
     <w:p>
       <w:pPr>
-        <w:pStyle w:val="Title"/>
-      </w:pPr>
-      <w:r>
-        <w:t xml:space="preserve">Title</w:t>
-      </w:r>
-    </w:p>
-    <w:p>
-      <w:pPr>
-        <w:pStyle w:val="Subtitle"/>
-      </w:pPr>
-      <w:r>
-        <w:t xml:space="preserve">Subtitle</w:t>
-      </w:r>
-    </w:p>
-    <w:p>
-      <w:pPr>
-        <w:pStyle w:val="Author"/>
-      </w:pPr>
-      <w:r>
-        <w:t xml:space="preserve">Author</w:t>
-      </w:r>
-    </w:p>
-    <w:p>
-      <w:pPr>
-        <w:pStyle w:val="Date"/>
-      </w:pPr>
-      <w:r>
-        <w:t xml:space="preserve">Date</w:t>
-      </w:r>
-    </w:p>
-    <w:p>
-      <w:pPr>
-        <w:pStyle w:val="Abstract"/>
-      </w:pPr>
-      <w:r>
-        <w:t xml:space="preserve">Abstract</w:t>
-      </w:r>
-    </w:p>
+        <w:pStyle w:val="CoverMark"/>
+      </w:pPr>
+      <w:r>
+        <w:drawing>
+          <wp:inline>
+            <wp:extent cx="914400" cy="914400"/>
+            <wp:effectExtent b="0" l="0" r="0" t="0"/>
+            <wp:docPr descr="" title="" id="10" name="Picture"/>
+            <a:graphic>
+              <a:graphicData uri="http://schemas.openxmlformats.org/drawingml/2006/picture">
+                <pic:pic>
+                  <pic:nvPicPr>
+                    <pic:cNvPr descr="iter8-mark.png" id="11" name="Picture"/>
+                    <pic:cNvPicPr>
+                      <a:picLocks noChangeArrowheads="1" noChangeAspect="1"/>
+                    </pic:cNvPicPr>
+                  </pic:nvPicPr>
+                  <pic:blipFill>
+                    <a:blip r:embed="rId9"/>
+                    <a:stretch>
+                      <a:fillRect/>
+                    </a:stretch>
+                  </pic:blipFill>
+                  <pic:spPr bwMode="auto">
+                    <a:xfrm>
+                      <a:off x="0" y="0"/>
+                      <a:ext cx="914400" cy="914400"/>
+                    </a:xfrm>
+                    <a:prstGeom prst="rect">
+                      <a:avLst/>
+                    </a:prstGeom>
+                    <a:noFill/>
+                    <a:ln w="9525">
+                      <a:noFill/>
+                      <a:headEnd/>
+                      <a:tailEnd/>
+                    </a:ln>
+                  </pic:spPr>
+                </pic:pic>
+              </a:graphicData>
+            </a:graphic>
+          </wp:inline>
+        </w:drawing>
+      </w:r>
+    </w:p>
+    <w:p>
+      <w:pPr>
+        <w:pStyle w:val="CoverTitle"/>
+      </w:pPr>
+      <w:r>
+        <w:t xml:space="preserve">The iter8-it journey</w:t>
+      </w:r>
+    </w:p>
+    <w:p>
+      <w:pPr>
+        <w:pStyle w:val="CoverSubtitle"/>
+      </w:pPr>
+      <w:r>
+        <w:t xml:space="preserve">From</w:t>
+      </w:r>
+      <w:r>
+        <w:t xml:space="preserve"> </w:t>
+      </w:r>
+      <w:r>
+        <w:t xml:space="preserve">“I have a problem”</w:t>
+      </w:r>
+      <w:r>
+        <w:t xml:space="preserve"> </w:t>
+      </w:r>
+      <w:r>
+        <w:t xml:space="preserve">to</w:t>
+      </w:r>
+      <w:r>
+        <w:t xml:space="preserve"> </w:t>
+      </w:r>
+      <w:r>
+        <w:t xml:space="preserve">“my app is live and getting better”</w:t>
+      </w:r>
+      <w:r>
+        <w:t xml:space="preserve">, one step at a time.</w:t>
+      </w:r>
+    </w:p>
+    <w:p>
+      <w:pPr>
+        <w:pStyle w:val="CoverNote"/>
+      </w:pPr>
+      <w:r>
+        <w:t xml:space="preserve">Iter8 Community · www.iter8.community</w:t>
+      </w:r>
+    </w:p>
+    <w:p>
+      <w:pPr>
+        <w:pStyle w:val="CoverNote"/>
+      </w:pPr>
+      <w:r>
+        <w:t xml:space="preserve">iter8-it v0.13.0 · October 1, 2026</w:t>
+      </w:r>
+    </w:p>
+    <w:p>
+      <w:r>
+        <w:br w:type="page"/>
+      </w:r>
+    </w:p>
+    <w:p>
+      <w:pPr>
+        <w:pStyle w:val="FrontHeading"/>
+      </w:pPr>
+      <w:r>
+        <w:t xml:space="preserve">About this booklet</w:t>
+      </w:r>
+    </w:p>
+    <w:p>
+      <w:pPr>
+        <w:pStyle w:val="BodyText"/>
+      </w:pPr>
+      <w:r>
+        <w:t xml:space="preserve">This booklet walks through</w:t>
+      </w:r>
+      <w:r>
+        <w:t xml:space="preserve"> </w:t>
+      </w:r>
+      <w:r>
+        <w:rPr>
+          <w:b/>
+          <w:bCs/>
+        </w:rPr>
+        <w:t xml:space="preserve">iter8-it</w:t>
+      </w:r>
+      <w:r>
+        <w:t xml:space="preserve">, a set of steps for Claude Code</w:t>
+      </w:r>
+      <w:r>
+        <w:t xml:space="preserve"> </w:t>
+      </w:r>
+      <w:r>
+        <w:t xml:space="preserve">that takes you from an idea to a live app that keeps getting better. Each</w:t>
+      </w:r>
+      <w:r>
+        <w:t xml:space="preserve"> </w:t>
+      </w:r>
+      <w:r>
+        <w:t xml:space="preserve">step has its own short chapter: what it’s for, what happens, what you end</w:t>
+      </w:r>
+      <w:r>
+        <w:t xml:space="preserve"> </w:t>
+      </w:r>
+      <w:r>
+        <w:t xml:space="preserve">up with, and what it asks of you.</w:t>
+      </w:r>
+    </w:p>
+    <w:p>
+      <w:pPr>
+        <w:pStyle w:val="BodyText"/>
+      </w:pPr>
+      <w:r>
+        <w:rPr>
+          <w:b/>
+          <w:bCs/>
+        </w:rPr>
+        <w:t xml:space="preserve">Who it’s for.</w:t>
+      </w:r>
+      <w:r>
+        <w:t xml:space="preserve"> </w:t>
+      </w:r>
+      <w:r>
+        <w:t xml:space="preserve">Anyone with an idea for a simple app, especially people</w:t>
+      </w:r>
+      <w:r>
+        <w:t xml:space="preserve"> </w:t>
+      </w:r>
+      <w:r>
+        <w:t xml:space="preserve">who’ve never built one. You bring the idea and make the decisions. Claude</w:t>
+      </w:r>
+      <w:r>
+        <w:t xml:space="preserve"> </w:t>
+      </w:r>
+      <w:r>
+        <w:t xml:space="preserve">asks the questions, writes the code, runs the checks and handles the</w:t>
+      </w:r>
+      <w:r>
+        <w:t xml:space="preserve"> </w:t>
+      </w:r>
+      <w:r>
+        <w:t xml:space="preserve">setup.</w:t>
+      </w:r>
+    </w:p>
+    <w:p>
+      <w:pPr>
+        <w:pStyle w:val="BodyText"/>
+      </w:pPr>
+      <w:r>
+        <w:rPr>
+          <w:b/>
+          <w:bCs/>
+        </w:rPr>
+        <w:t xml:space="preserve">How to read it.</w:t>
+      </w:r>
+      <w:r>
+        <w:t xml:space="preserve"> </w:t>
+      </w:r>
+      <w:r>
+        <w:t xml:space="preserve">Start with the overview,</w:t>
+      </w:r>
+      <w:r>
+        <w:t xml:space="preserve"> </w:t>
+      </w:r>
+      <w:r>
+        <w:rPr>
+          <w:i/>
+          <w:iCs/>
+        </w:rPr>
+        <w:t xml:space="preserve">The iter8-it journey</w:t>
+      </w:r>
+      <w:r>
+        <w:t xml:space="preserve">, to</w:t>
+      </w:r>
+      <w:r>
+        <w:t xml:space="preserve"> </w:t>
+      </w:r>
+      <w:r>
+        <w:t xml:space="preserve">see how the steps fit together. Then read each step just before you run</w:t>
+      </w:r>
+      <w:r>
+        <w:t xml:space="preserve"> </w:t>
+      </w:r>
+      <w:r>
+        <w:t xml:space="preserve">it, or read it all at once to know what’s coming. You’ll go through the</w:t>
+      </w:r>
+      <w:r>
+        <w:t xml:space="preserve"> </w:t>
+      </w:r>
+      <w:r>
+        <w:t xml:space="preserve">first six steps once. After that, Build It and Ship It repeat for every</w:t>
+      </w:r>
+      <w:r>
+        <w:t xml:space="preserve"> </w:t>
+      </w:r>
+      <w:r>
+        <w:t xml:space="preserve">release, and Meet It, Dream It and Trim It come back whenever you’ve</w:t>
+      </w:r>
+      <w:r>
+        <w:t xml:space="preserve"> </w:t>
+      </w:r>
+      <w:r>
+        <w:t xml:space="preserve">learned something.</w:t>
+      </w:r>
+    </w:p>
+    <w:p>
+      <w:pPr>
+        <w:pStyle w:val="BodyText"/>
+      </w:pPr>
+      <w:r>
+        <w:rPr>
+          <w:b/>
+          <w:bCs/>
+        </w:rPr>
+        <w:t xml:space="preserve">What you need to start.</w:t>
+      </w:r>
+      <w:r>
+        <w:t xml:space="preserve"> </w:t>
+      </w:r>
+      <w:r>
+        <w:t xml:space="preserve">A computer with Claude Code, and free GitHub</w:t>
+      </w:r>
+      <w:r>
+        <w:t xml:space="preserve"> </w:t>
+      </w:r>
+      <w:r>
+        <w:t xml:space="preserve">and Vercel accounts. Claim It checks everything else and tells you what’s</w:t>
+      </w:r>
+      <w:r>
+        <w:t xml:space="preserve"> </w:t>
+      </w:r>
+      <w:r>
+        <w:t xml:space="preserve">missing. If your app needs to save data, Docker Desktop (also free) comes</w:t>
+      </w:r>
+      <w:r>
+        <w:t xml:space="preserve"> </w:t>
+      </w:r>
+      <w:r>
+        <w:t xml:space="preserve">in later.</w:t>
+      </w:r>
+    </w:p>
+    <w:p>
+      <w:pPr>
+        <w:pStyle w:val="BodyText"/>
+      </w:pPr>
+      <w:r>
+        <w:rPr>
+          <w:b/>
+          <w:bCs/>
+        </w:rPr>
+        <w:t xml:space="preserve">Where to find more.</w:t>
+      </w:r>
+      <w:r>
+        <w:t xml:space="preserve"> </w:t>
+      </w:r>
+      <w:r>
+        <w:t xml:space="preserve">The Iter8 Community: www.iter8.community.</w:t>
+      </w:r>
+    </w:p>
+    <w:p>
+      <w:pPr>
+        <w:pStyle w:val="FrontHeading"/>
+      </w:pPr>
+      <w:r>
+        <w:t xml:space="preserve">Contents</w:t>
+      </w:r>
+    </w:p>
+    <w:p>
+      <w:r>
+        <w:fldChar w:fldCharType="begin" w:dirty="true"/>
+      </w:r>
+      <w:r>
+        <w:instrText xml:space="preserve"> TOC \o "1-1" \h \z \u </w:instrText>
+      </w:r>
+      <w:r>
+        <w:fldChar w:fldCharType="separate"/>
+      </w:r>
+      <w:r>
+        <w:t>(Word fills in the contents when the document is opened. If it asks to update fields, choose Yes.)</w:t>
+      </w:r>
+      <w:r>
+        <w:fldChar w:fldCharType="end"/>
+      </w:r>
+    </w:p>
+    <w:p>
+      <w:r>
+        <w:br w:type="page"/>
+      </w:r>
+    </w:p>
+    <w:bookmarkStart w:id="17" w:name="trim-it"/>
     <w:p>
       <w:pPr>
         <w:pStyle w:val="Heading1"/>
       </w:pPr>
-      <w:bookmarkStart w:id="21" w:name="heading-1"/>
-      <w:r>
-        <w:t xml:space="preserve">Heading 1</w:t>
-      </w:r>
-      <w:bookmarkEnd w:id="21"/>
-    </w:p>
+      <w:r>
+        <w:t xml:space="preserve">Trim It</w:t>
+      </w:r>
+    </w:p>
+    <w:p>
+      <w:pPr>
+        <w:pStyle w:val="FirstParagraph"/>
+      </w:pPr>
+      <w:r>
+        <w:rPr>
+          <w:b/>
+          <w:bCs/>
+        </w:rPr>
+        <w:t xml:space="preserve">Cut the list down to the smallest version someone would actually use,</w:t>
+      </w:r>
+      <w:r>
+        <w:rPr>
+          <w:b/>
+          <w:bCs/>
+        </w:rPr>
+        <w:t xml:space="preserve"> </w:t>
+      </w:r>
+      <w:r>
+        <w:rPr>
+          <w:b/>
+          <w:bCs/>
+        </w:rPr>
+        <w:t xml:space="preserve">and keep choosing what’s next.</w:t>
+      </w:r>
+    </w:p>
+    <w:p>
+      <w:pPr>
+        <w:pStyle w:val="BodyText"/>
+      </w:pPr>
+      <w:r>
+        <w:t xml:space="preserve">Dream It filled the Backlog. Trim It decides what’s worth building</w:t>
+      </w:r>
+      <w:r>
+        <w:t xml:space="preserve"> </w:t>
+      </w:r>
+      <w:r>
+        <w:rPr>
+          <w:i/>
+          <w:iCs/>
+        </w:rPr>
+        <w:t xml:space="preserve">now</w:t>
+      </w:r>
+      <w:r>
+        <w:t xml:space="preserve">. The question for every idea is simple:</w:t>
+      </w:r>
+      <w:r>
+        <w:t xml:space="preserve"> </w:t>
+      </w:r>
+      <w:r>
+        <w:rPr>
+          <w:b/>
+          <w:bCs/>
+        </w:rPr>
+        <w:t xml:space="preserve">would anyone miss this in</w:t>
+      </w:r>
+      <w:r>
+        <w:rPr>
+          <w:b/>
+          <w:bCs/>
+        </w:rPr>
+        <w:t xml:space="preserve"> </w:t>
+      </w:r>
+      <w:r>
+        <w:rPr>
+          <w:b/>
+          <w:bCs/>
+        </w:rPr>
+        <w:t xml:space="preserve">the next version?</w:t>
+      </w:r>
+      <w:r>
+        <w:t xml:space="preserve"> </w:t>
+      </w:r>
+      <w:r>
+        <w:t xml:space="preserve">If not, it waits. Cutting isn’t failure. It’s how you</w:t>
+      </w:r>
+      <w:r>
+        <w:t xml:space="preserve"> </w:t>
+      </w:r>
+      <w:r>
+        <w:t xml:space="preserve">get something real into people’s hands quickly, and then learn what</w:t>
+      </w:r>
+      <w:r>
+        <w:t xml:space="preserve"> </w:t>
+      </w:r>
+      <w:r>
+        <w:t xml:space="preserve">actually matters.</w:t>
+      </w:r>
+    </w:p>
+    <w:bookmarkStart w:id="12" w:name="what-happens"/>
     <w:p>
       <w:pPr>
         <w:pStyle w:val="Heading2"/>
       </w:pPr>
-      <w:bookmarkStart w:id="22" w:name="heading-2"/>
-      <w:r>
-        <w:t xml:space="preserve">Heading 2</w:t>
-      </w:r>
-      <w:bookmarkEnd w:id="22"/>
-    </w:p>
-    <w:p>
-      <w:pPr>
-        <w:pStyle w:val="Heading3"/>
-      </w:pPr>
-      <w:bookmarkStart w:id="23" w:name="heading-3"/>
-      <w:r>
-        <w:t xml:space="preserve">Heading 3</w:t>
-      </w:r>
-      <w:bookmarkEnd w:id="23"/>
-    </w:p>
-    <w:p>
-      <w:pPr>
-        <w:pStyle w:val="Heading4"/>
-      </w:pPr>
-      <w:bookmarkStart w:id="24" w:name="heading-4"/>
-      <w:r>
-        <w:t xml:space="preserve">Heading 4</w:t>
-      </w:r>
-      <w:bookmarkEnd w:id="24"/>
-    </w:p>
-    <w:p>
-      <w:pPr>
-        <w:pStyle w:val="Heading5"/>
-      </w:pPr>
-      <w:bookmarkStart w:id="25" w:name="heading-5"/>
-      <w:r>
-        <w:t xml:space="preserve">Heading 5</w:t>
-      </w:r>
-      <w:bookmarkEnd w:id="25"/>
-    </w:p>
-    <w:p>
-      <w:pPr>
-        <w:pStyle w:val="Heading6"/>
-      </w:pPr>
-      <w:bookmarkStart w:id="26" w:name="heading-6"/>
-      <w:r>
-        <w:t xml:space="preserve">Heading 6</w:t>
-      </w:r>
-      <w:bookmarkEnd w:id="26"/>
-    </w:p>
-    <w:p>
-      <w:pPr>
-        <w:pStyle w:val="Heading7"/>
-      </w:pPr>
-      <w:bookmarkStart w:id="27" w:name="heading-7"/>
-      <w:r>
-        <w:t xml:space="preserve">Heading 7</w:t>
-      </w:r>
-      <w:bookmarkEnd w:id="27"/>
-    </w:p>
-    <w:p>
-      <w:pPr>
-        <w:pStyle w:val="Heading8"/>
-      </w:pPr>
-      <w:bookmarkStart w:id="28" w:name="heading-8"/>
-      <w:r>
-        <w:t xml:space="preserve">Heading 8</w:t>
-      </w:r>
-      <w:bookmarkEnd w:id="28"/>
-    </w:p>
-    <w:p>
-      <w:pPr>
-        <w:pStyle w:val="Heading9"/>
-      </w:pPr>
-      <w:bookmarkStart w:id="29" w:name="heading-9"/>
-      <w:r>
-        <w:t xml:space="preserve">Heading 9</w:t>
-      </w:r>
-      <w:bookmarkEnd w:id="29"/>
+      <w:r>
+        <w:t xml:space="preserve">What happens</w:t>
+      </w:r>
     </w:p>
     <w:p>
       <w:pPr>
         <w:pStyle w:val="FirstParagraph"/>
       </w:pPr>
       <w:r>
-        <w:t xml:space="preserve">First Paragraph.</w:t>
-      </w:r>
-    </w:p>
-    <w:p>
-      <w:pPr>
-        <w:pStyle w:val="BodyText"/>
-      </w:pPr>
-      <w:r>
-        <w:t xml:space="preserve">Body Text. Body Text Char.</w:t>
-      </w:r>
-      <w:r>
-        <w:t xml:space="preserve"> </w:t>
-      </w:r>
-      <w:r>
-        <w:rPr>
-          <w:rStyle w:val="VerbatimChar"/>
-        </w:rPr>
-        <w:t xml:space="preserve">Verbatim Char</w:t>
-      </w:r>
-      <w:r>
-        <w:t xml:space="preserve">.</w:t>
-      </w:r>
-      <w:r>
-        <w:t xml:space="preserve"> </w:t>
-      </w:r>
-      <w:hyperlink r:id="rId30">
-        <w:r>
-          <w:rPr>
-            <w:rStyle w:val="Hyperlink"/>
-          </w:rPr>
-          <w:t xml:space="preserve">Hyperlink</w:t>
-        </w:r>
-      </w:hyperlink>
-      <w:r>
-        <w:t xml:space="preserve">.</w:t>
-      </w:r>
-      <w:r>
-        <w:t xml:space="preserve"> </w:t>
-      </w:r>
-      <w:r>
-        <w:t xml:space="preserve">Footnote.</w:t>
-      </w:r>
-      <w:r>
-        <w:rPr>
-          <w:rStyle w:val="FootnoteReference"/>
-        </w:rPr>
-        <w:footnoteReference w:id="31"/>
-      </w:r>
-    </w:p>
-    <w:p>
-      <w:pPr>
-        <w:pStyle w:val="BlockText"/>
-      </w:pPr>
-      <w:r>
-        <w:t xml:space="preserve">Block Text.</w:t>
-      </w:r>
-    </w:p>
-    <w:p>
-      <w:pPr>
-        <w:pStyle w:val="TableCaption"/>
-      </w:pPr>
-      <w:r>
-        <w:t xml:space="preserve">Table caption.</w:t>
+        <w:t xml:space="preserve">First, one sentence: what should someone be able to do, start to finish,</w:t>
+      </w:r>
+      <w:r>
+        <w:t xml:space="preserve"> </w:t>
+      </w:r>
+      <w:r>
+        <w:t xml:space="preserve">when this version is live? That’s the test for every idea. Then Claude</w:t>
+      </w:r>
+      <w:r>
+        <w:t xml:space="preserve"> </w:t>
+      </w:r>
+      <w:r>
+        <w:t xml:space="preserve">walks the Backlog with you, one idea at a time. Each gets one of four</w:t>
+      </w:r>
+      <w:r>
+        <w:t xml:space="preserve"> </w:t>
+      </w:r>
+      <w:r>
+        <w:t xml:space="preserve">decisions:</w:t>
       </w:r>
     </w:p>
     <w:tbl>
       <w:tblPr>
         <w:tblStyle w:val="Table"/>
-        <w:tblLook w:firstRow="1"/>
-        <w:tblCaption w:val="Table caption."/>
+        <w:tblW w:type="pct" w:w="5000"/>
+        <w:tblLayout w:type="fixed"/>
+        <w:tblLook w:firstRow="1" w:lastRow="0" w:firstColumn="0" w:lastColumn="0" w:noHBand="0" w:noVBand="0" w:val="0020"/>
       </w:tblPr>
-      <w:tblGrid/>
+      <w:tblGrid>
+        <w:gridCol w:w="3960"/>
+        <w:gridCol w:w="3960"/>
+      </w:tblGrid>
       <w:tr>
         <w:trPr>
-          <w:cnfStyle w:firstRow="1" w:val="100000000000"/>
+          <w:tblHeader w:val="on"/>
         </w:trPr>
         <w:tc>
-          <w:tcPr>
-            <w:tcBorders>
-              <w:bottom w:val="single"/>
-            </w:tcBorders>
-            <w:vAlign w:val="bottom"/>
-          </w:tcPr>
+          <w:tcPr/>
           <w:p>
             <w:pPr>
               <w:pStyle w:val="Compact"/>
-              <w:jc w:val="left"/>
             </w:pPr>
             <w:r>
-              <w:t xml:space="preserve">Table</w:t>
+              <w:t xml:space="preserve">Decision</w:t>
             </w:r>
           </w:p>
         </w:tc>
         <w:tc>
-          <w:tcPr>
-            <w:tcBorders>
-              <w:bottom w:val="single"/>
-            </w:tcBorders>
-            <w:vAlign w:val="bottom"/>
-          </w:tcPr>
+          <w:tcPr/>
           <w:p>
             <w:pPr>
               <w:pStyle w:val="Compact"/>
-              <w:jc w:val="left"/>
             </w:pPr>
             <w:r>
-              <w:t xml:space="preserve">Table</w:t>
+              <w:t xml:space="preserve">What happens</w:t>
             </w:r>
           </w:p>
         </w:tc>
       </w:tr>
       <w:tr>
         <w:tc>
+          <w:tcPr/>
           <w:p>
             <w:pPr>
               <w:pStyle w:val="Compact"/>
-              <w:jc w:val="left"/>
             </w:pPr>
             <w:r>
-              <w:t xml:space="preserve">1</w:t>
+              <w:rPr>
+                <w:b/>
+                <w:bCs/>
+              </w:rPr>
+              <w:t xml:space="preserve">Next</w:t>
             </w:r>
           </w:p>
         </w:tc>
         <w:tc>
+          <w:tcPr/>
           <w:p>
             <w:pPr>
               <w:pStyle w:val="Compact"/>
-              <w:jc w:val="left"/>
             </w:pPr>
             <w:r>
-              <w:t xml:space="preserve">2</w:t>
+              <w:t xml:space="preserve">Moves to</w:t>
+            </w:r>
+            <w:r>
+              <w:t xml:space="preserve"> </w:t>
+            </w:r>
+            <w:r>
+              <w:rPr>
+                <w:b/>
+                <w:bCs/>
+              </w:rPr>
+              <w:t xml:space="preserve">Todo</w:t>
+            </w:r>
+            <w:r>
+              <w:t xml:space="preserve">, in the order to build it.</w:t>
+            </w:r>
+          </w:p>
+        </w:tc>
+      </w:tr>
+      <w:tr>
+        <w:tc>
+          <w:tcPr/>
+          <w:p>
+            <w:pPr>
+              <w:pStyle w:val="Compact"/>
+            </w:pPr>
+            <w:r>
+              <w:rPr>
+                <w:b/>
+                <w:bCs/>
+              </w:rPr>
+              <w:t xml:space="preserve">Later</w:t>
+            </w:r>
+          </w:p>
+        </w:tc>
+        <w:tc>
+          <w:tcPr/>
+          <w:p>
+            <w:pPr>
+              <w:pStyle w:val="Compact"/>
+            </w:pPr>
+            <w:r>
+              <w:t xml:space="preserve">Stays in Backlog with a</w:t>
+            </w:r>
+            <w:r>
+              <w:t xml:space="preserve"> </w:t>
+            </w:r>
+            <w:r>
+              <w:rPr>
+                <w:rStyle w:val="VerbatimChar"/>
+              </w:rPr>
+              <w:t xml:space="preserve">later</w:t>
+            </w:r>
+            <w:r>
+              <w:t xml:space="preserve"> </w:t>
+            </w:r>
+            <w:r>
+              <w:t xml:space="preserve">tag and the reason, so you remember why.</w:t>
+            </w:r>
+          </w:p>
+        </w:tc>
+      </w:tr>
+      <w:tr>
+        <w:tc>
+          <w:tcPr/>
+          <w:p>
+            <w:pPr>
+              <w:pStyle w:val="Compact"/>
+            </w:pPr>
+            <w:r>
+              <w:rPr>
+                <w:b/>
+                <w:bCs/>
+              </w:rPr>
+              <w:t xml:space="preserve">Never</w:t>
+            </w:r>
+          </w:p>
+        </w:tc>
+        <w:tc>
+          <w:tcPr/>
+          <w:p>
+            <w:pPr>
+              <w:pStyle w:val="Compact"/>
+            </w:pPr>
+            <w:r>
+              <w:t xml:space="preserve">Closed as</w:t>
+            </w:r>
+            <w:r>
+              <w:t xml:space="preserve"> </w:t>
+            </w:r>
+            <w:r>
+              <w:t xml:space="preserve">“not planned”</w:t>
+            </w:r>
+            <w:r>
+              <w:t xml:space="preserve">, with the reason. It can be reopened.</w:t>
+            </w:r>
+          </w:p>
+        </w:tc>
+      </w:tr>
+      <w:tr>
+        <w:tc>
+          <w:tcPr/>
+          <w:p>
+            <w:pPr>
+              <w:pStyle w:val="Compact"/>
+            </w:pPr>
+            <w:r>
+              <w:rPr>
+                <w:b/>
+                <w:bCs/>
+              </w:rPr>
+              <w:t xml:space="preserve">Not decided</w:t>
+            </w:r>
+          </w:p>
+        </w:tc>
+        <w:tc>
+          <w:tcPr/>
+          <w:p>
+            <w:pPr>
+              <w:pStyle w:val="Compact"/>
+            </w:pPr>
+            <w:r>
+              <w:t xml:space="preserve">Stays in Backlog. Fine for brand-new ideas.</w:t>
             </w:r>
           </w:p>
         </w:tc>
@@ -275,54 +658,403 @@
     </w:tbl>
     <w:p>
       <w:pPr>
-        <w:pStyle w:val="ImageCaption"/>
-      </w:pPr>
-      <w:r>
-        <w:t xml:space="preserve">Image Caption</w:t>
-      </w:r>
-    </w:p>
-    <w:p>
-      <w:pPr>
-        <w:pStyle w:val="DefinitionTerm"/>
-      </w:pPr>
-      <w:r>
-        <w:t xml:space="preserve">DefinitionTerm</w:t>
-      </w:r>
-    </w:p>
-    <w:p>
-      <w:pPr>
-        <w:pStyle w:val="Definition"/>
-      </w:pPr>
-      <w:r>
-        <w:t xml:space="preserve">Definition</w:t>
-      </w:r>
-    </w:p>
-    <w:p>
-      <w:pPr>
-        <w:pStyle w:val="DefinitionTerm"/>
-      </w:pPr>
-      <w:r>
-        <w:t xml:space="preserve">DefinitionTerm</w:t>
-      </w:r>
-    </w:p>
-    <w:p>
-      <w:pPr>
-        <w:pStyle w:val="Definition"/>
-      </w:pPr>
-      <w:r>
-        <w:t xml:space="preserve">Definition</w:t>
-      </w:r>
-    </w:p>
+        <w:pStyle w:val="BodyText"/>
+      </w:pPr>
+      <w:r>
+        <w:t xml:space="preserve">Then you put Todo in</w:t>
+      </w:r>
+      <w:r>
+        <w:t xml:space="preserve"> </w:t>
+      </w:r>
+      <w:r>
+        <w:rPr>
+          <w:b/>
+          <w:bCs/>
+        </w:rPr>
+        <w:t xml:space="preserve">build order</w:t>
+      </w:r>
+      <w:r>
+        <w:t xml:space="preserve">, aiming for something usable end to</w:t>
+      </w:r>
+      <w:r>
+        <w:t xml:space="preserve"> </w:t>
+      </w:r>
+      <w:r>
+        <w:t xml:space="preserve">end as early as possible. A thin version of the whole journey beats one</w:t>
+      </w:r>
+      <w:r>
+        <w:t xml:space="preserve"> </w:t>
+      </w:r>
+      <w:r>
+        <w:t xml:space="preserve">perfect piece.</w:t>
+      </w:r>
+    </w:p>
+    <w:p>
+      <w:pPr>
+        <w:pStyle w:val="BodyText"/>
+      </w:pPr>
+      <w:r>
+        <w:t xml:space="preserve">The first time, Trim It also asks two questions that shape everything</w:t>
+      </w:r>
+      <w:r>
+        <w:t xml:space="preserve"> </w:t>
+      </w:r>
+      <w:r>
+        <w:t xml:space="preserve">under the hood:</w:t>
+      </w:r>
+      <w:r>
+        <w:t xml:space="preserve"> </w:t>
+      </w:r>
+      <w:r>
+        <w:rPr>
+          <w:b/>
+          <w:bCs/>
+        </w:rPr>
+        <w:t xml:space="preserve">Do people sign in? Does the app need to remember</w:t>
+      </w:r>
+      <w:r>
+        <w:rPr>
+          <w:b/>
+          <w:bCs/>
+        </w:rPr>
+        <w:t xml:space="preserve"> </w:t>
+      </w:r>
+      <w:r>
+        <w:rPr>
+          <w:b/>
+          <w:bCs/>
+        </w:rPr>
+        <w:t xml:space="preserve">anything?</w:t>
+      </w:r>
+      <w:r>
+        <w:t xml:space="preserve"> </w:t>
+      </w:r>
+      <w:r>
+        <w:t xml:space="preserve">If not, there’s no database at all: simpler, and free</w:t>
+      </w:r>
+      <w:r>
+        <w:t xml:space="preserve"> </w:t>
+      </w:r>
+      <w:r>
+        <w:t xml:space="preserve">forever.</w:t>
+      </w:r>
+    </w:p>
+    <w:bookmarkEnd w:id="12"/>
+    <w:bookmarkStart w:id="13" w:name="grooming-trim-it-again-and-again"/>
+    <w:p>
+      <w:pPr>
+        <w:pStyle w:val="Heading2"/>
+      </w:pPr>
+      <w:r>
+        <w:t xml:space="preserve">Grooming: Trim It again and again</w:t>
+      </w:r>
+    </w:p>
+    <w:p>
+      <w:pPr>
+        <w:pStyle w:val="FirstParagraph"/>
+      </w:pPr>
+      <w:r>
+        <w:t xml:space="preserve">Trim It isn’t only for the first version.</w:t>
+      </w:r>
+      <w:r>
+        <w:t xml:space="preserve"> </w:t>
+      </w:r>
+      <w:r>
+        <w:rPr>
+          <w:b/>
+          <w:bCs/>
+        </w:rPr>
+        <w:t xml:space="preserve">Run it whenever Todo is</w:t>
+      </w:r>
+      <w:r>
+        <w:rPr>
+          <w:b/>
+          <w:bCs/>
+        </w:rPr>
+        <w:t xml:space="preserve"> </w:t>
+      </w:r>
+      <w:r>
+        <w:rPr>
+          <w:b/>
+          <w:bCs/>
+        </w:rPr>
+        <w:t xml:space="preserve">getting short</w:t>
+      </w:r>
+      <w:r>
+        <w:t xml:space="preserve">, new ideas have piled up, or plans have changed. It</w:t>
+      </w:r>
+      <w:r>
+        <w:t xml:space="preserve"> </w:t>
+      </w:r>
+      <w:r>
+        <w:t xml:space="preserve">looks again at the parked</w:t>
+      </w:r>
+      <w:r>
+        <w:t xml:space="preserve"> </w:t>
+      </w:r>
+      <w:r>
+        <w:rPr>
+          <w:rStyle w:val="VerbatimChar"/>
+        </w:rPr>
+        <w:t xml:space="preserve">later</w:t>
+      </w:r>
+      <w:r>
+        <w:t xml:space="preserve"> </w:t>
+      </w:r>
+      <w:r>
+        <w:t xml:space="preserve">ideas (</w:t>
+      </w:r>
+      <w:r>
+        <w:t xml:space="preserve">“is that reason still true?”</w:t>
+      </w:r>
+      <w:r>
+        <w:t xml:space="preserve">),</w:t>
+      </w:r>
+      <w:r>
+        <w:t xml:space="preserve"> </w:t>
+      </w:r>
+      <w:r>
+        <w:t xml:space="preserve">picks the next batch and puts them in order. What’s Next and Ship It</w:t>
+      </w:r>
+      <w:r>
+        <w:t xml:space="preserve"> </w:t>
+      </w:r>
+      <w:r>
+        <w:t xml:space="preserve">will both suggest it when Todo runs out.</w:t>
+      </w:r>
+    </w:p>
+    <w:p>
+      <w:pPr>
+        <w:pStyle w:val="BodyText"/>
+      </w:pPr>
+      <w:r>
+        <w:t xml:space="preserve">And you can always drag cards between Backlog and Todo yourself. The</w:t>
+      </w:r>
+      <w:r>
+        <w:t xml:space="preserve"> </w:t>
+      </w:r>
+      <w:r>
+        <w:t xml:space="preserve">board is the plan, and every step follows it.</w:t>
+      </w:r>
+    </w:p>
+    <w:bookmarkEnd w:id="13"/>
+    <w:bookmarkStart w:id="14" w:name="what-you-end-up-with"/>
+    <w:p>
+      <w:pPr>
+        <w:pStyle w:val="Heading2"/>
+      </w:pPr>
+      <w:r>
+        <w:t xml:space="preserve">What you end up with</w:t>
+      </w:r>
+    </w:p>
+    <w:p>
+      <w:pPr>
+        <w:pStyle w:val="SourceCode"/>
+      </w:pPr>
+      <w:r>
+        <w:rPr>
+          <w:rStyle w:val="VerbatimChar"/>
+        </w:rPr>
+        <w:t xml:space="preserve">Backlog -&gt; Todo -&gt; In Progress -&gt; In Review -&gt; Done</w:t>
+      </w:r>
+      <w:r>
+        <w:br/>
+      </w:r>
+      <w:r>
+        <w:rPr>
+          <w:rStyle w:val="VerbatimChar"/>
+        </w:rPr>
+        <w:t xml:space="preserve"> ideas     next      building      checking     live</w:t>
+      </w:r>
+    </w:p>
+    <w:p>
+      <w:pPr>
+        <w:pStyle w:val="Compact"/>
+        <w:numPr>
+          <w:ilvl w:val="0"/>
+          <w:numId w:val="1001"/>
+        </w:numPr>
+      </w:pPr>
+      <w:r>
+        <w:t xml:space="preserve">A Todo column that says exactly what to build, in what order.</w:t>
+      </w:r>
+    </w:p>
+    <w:p>
+      <w:pPr>
+        <w:pStyle w:val="Compact"/>
+        <w:numPr>
+          <w:ilvl w:val="0"/>
+          <w:numId w:val="1001"/>
+        </w:numPr>
+      </w:pPr>
+      <w:r>
+        <w:t xml:space="preserve">A Backlog of everything else, with reasons attached.</w:t>
+      </w:r>
+    </w:p>
+    <w:p>
+      <w:pPr>
+        <w:pStyle w:val="Compact"/>
+        <w:numPr>
+          <w:ilvl w:val="0"/>
+          <w:numId w:val="1001"/>
+        </w:numPr>
+      </w:pPr>
+      <w:r>
+        <w:t xml:space="preserve">A short description of the first version in</w:t>
+      </w:r>
+      <w:r>
+        <w:t xml:space="preserve"> </w:t>
+      </w:r>
+      <w:r>
+        <w:rPr>
+          <w:rStyle w:val="VerbatimChar"/>
+        </w:rPr>
+        <w:t xml:space="preserve">PRODUCT.md</w:t>
+      </w:r>
+      <w:r>
+        <w:t xml:space="preserve">.</w:t>
+      </w:r>
+    </w:p>
+    <w:bookmarkEnd w:id="14"/>
+    <w:bookmarkStart w:id="16" w:name="what-it-asks-of-you"/>
+    <w:p>
+      <w:pPr>
+        <w:pStyle w:val="Heading2"/>
+      </w:pPr>
+      <w:r>
+        <w:t xml:space="preserve">What it asks of you</w:t>
+      </w:r>
+    </w:p>
+    <w:tbl>
+      <w:tblPr>
+        <w:tblStyle w:val="Table"/>
+        <w:tblW w:type="auto" w:w="0"/>
+        <w:tblLook w:firstRow="0" w:lastRow="0" w:firstColumn="0" w:lastColumn="0" w:noHBand="0" w:noVBand="0" w:val="0000"/>
+      </w:tblPr>
+      <w:tblGrid>
+        <w:gridCol w:w="3960"/>
+        <w:gridCol w:w="3960"/>
+      </w:tblGrid>
+      <w:tr>
+        <w:tc>
+          <w:tcPr/>
+          <w:p>
+            <w:pPr>
+              <w:pStyle w:val="Compact"/>
+            </w:pPr>
+            <w:r>
+              <w:rPr>
+                <w:b/>
+                <w:bCs/>
+              </w:rPr>
+              <w:t xml:space="preserve">Time</w:t>
+            </w:r>
+          </w:p>
+        </w:tc>
+        <w:tc>
+          <w:tcPr/>
+          <w:p>
+            <w:pPr>
+              <w:pStyle w:val="Compact"/>
+            </w:pPr>
+            <w:r>
+              <w:t xml:space="preserve">20-30 minutes the first time; 10 minutes to groom</w:t>
+            </w:r>
+          </w:p>
+        </w:tc>
+      </w:tr>
+      <w:tr>
+        <w:tc>
+          <w:tcPr/>
+          <w:p>
+            <w:pPr>
+              <w:pStyle w:val="Compact"/>
+            </w:pPr>
+            <w:r>
+              <w:rPr>
+                <w:b/>
+                <w:bCs/>
+              </w:rPr>
+              <w:t xml:space="preserve">Decisions</w:t>
+            </w:r>
+          </w:p>
+        </w:tc>
+        <w:tc>
+          <w:tcPr/>
+          <w:p>
+            <w:pPr>
+              <w:pStyle w:val="Compact"/>
+            </w:pPr>
+            <w:r>
+              <w:t xml:space="preserve">What’s in, what waits, what goes, and the order</w:t>
+            </w:r>
+          </w:p>
+        </w:tc>
+      </w:tr>
+      <w:tr>
+        <w:tc>
+          <w:tcPr/>
+          <w:p>
+            <w:pPr>
+              <w:pStyle w:val="Compact"/>
+            </w:pPr>
+            <w:r>
+              <w:rPr>
+                <w:b/>
+                <w:bCs/>
+              </w:rPr>
+              <w:t xml:space="preserve">Cost</w:t>
+            </w:r>
+          </w:p>
+        </w:tc>
+        <w:tc>
+          <w:tcPr/>
+          <w:p>
+            <w:pPr>
+              <w:pStyle w:val="Compact"/>
+            </w:pPr>
+            <w:r>
+              <w:t xml:space="preserve">Nothing</w:t>
+            </w:r>
+          </w:p>
+        </w:tc>
+      </w:tr>
+    </w:tbl>
+    <w:p>
+      <w:pPr>
+        <w:pStyle w:val="BodyText"/>
+      </w:pPr>
+      <w:r>
+        <w:rPr>
+          <w:b/>
+          <w:bCs/>
+        </w:rPr>
+        <w:t xml:space="preserve">Next:</w:t>
+      </w:r>
+      <w:r>
+        <w:t xml:space="preserve"> </w:t>
+      </w:r>
+      <w:hyperlink r:id="rId15">
+        <w:r>
+          <w:rPr>
+            <w:rStyle w:val="Hyperlink"/>
+          </w:rPr>
+          <w:t xml:space="preserve">Build It</w:t>
+        </w:r>
+      </w:hyperlink>
+    </w:p>
+    <w:bookmarkEnd w:id="16"/>
+    <w:bookmarkEnd w:id="17"/>
     <w:sectPr>
-      <w:headerReference w:type="default" r:id="rIdHeader1"/>
-      <w:footerReference w:type="default" r:id="rIdFooter1"/>
-      <w:headerReference w:type="first" r:id="rIdHeader2"/>
-      <w:footerReference w:type="first" r:id="rIdFooter2"/>
+      <w:headerReference r:id="rIdHeader1" w:type="default"/>
+      <w:footerReference r:id="rIdFooter1" w:type="default"/>
+      <w:headerReference r:id="rIdHeader2" w:type="first"/>
+      <w:footerReference r:id="rIdFooter2" w:type="first"/>
       <w:footnotePr>
         <w:numRestart w:val="eachSect"/>
       </w:footnotePr>
-      <w:pgSz w:w="7920" w:h="12240" w:orient="landscape"/>
-      <w:pgMar w:top="720" w:right="720" w:bottom="720" w:left="720" w:header="360" w:footer="360" w:gutter="0"/>
+      <w:pgSz w:h="12240" w:orient="landscape" w:w="7920"/>
+      <w:pgMar w:bottom="720" w:footer="360" w:gutter="0" w:header="360" w:left="720" w:right="720" w:top="720"/>
       <w:titlePg/>
     </w:sectPr>
   </w:body>
@@ -431,30 +1163,6 @@
       </w:r>
     </w:p>
   </w:footnote>
-  <w:footnote w:id="31">
-    <w:p>
-      <w:pPr>
-        <w:pStyle w:val="FootnoteText"/>
-      </w:pPr>
-      <w:r>
-        <w:rPr>
-          <w:rStyle w:val="FootnoteReference"/>
-        </w:rPr>
-        <w:footnoteRef/>
-      </w:r>
-      <w:r>
-        <w:t>Footnote Text.</w:t>
-      </w:r>
-    </w:p>
-    <w:p>
-      <w:pPr>
-        <w:pStyle w:val="FootnoteBlockText"/>
-      </w:pPr>
-      <w:r>
-        <w:t>Footnote Block Text</w:t>
-      </w:r>
-    </w:p>
-  </w:footnote>
 </w:footnotes>
 </file>
 
@@ -523,17 +1231,14 @@
 <file path=word/numbering.xml><?xml version="1.0" encoding="utf-8"?>
 <w:numbering xmlns:w="http://schemas.openxmlformats.org/wordprocessingml/2006/main">
   <w:abstractNum w:abstractNumId="990">
-    <w:nsid w:val="170cd2de"/>
+    <w:nsid w:val="0000A990"/>
     <w:multiLevelType w:val="multilevel"/>
     <w:lvl w:ilvl="0">
       <w:numFmt w:val="bullet"/>
       <w:lvlText w:val=" "/>
       <w:lvlJc w:val="left"/>
       <w:pPr>
-        <w:tabs>
-          <w:tab w:val="num" w:pos="0"/>
-        </w:tabs>
-        <w:ind w:left="480" w:hanging="480"/>
+        <w:ind w:left="720" w:hanging="360"/>
       </w:pPr>
     </w:lvl>
     <w:lvl w:ilvl="1">
@@ -541,10 +1246,7 @@
       <w:lvlText w:val=" "/>
       <w:lvlJc w:val="left"/>
       <w:pPr>
-        <w:tabs>
-          <w:tab w:val="num" w:pos="720"/>
-        </w:tabs>
-        <w:ind w:left="1200" w:hanging="480"/>
+        <w:ind w:left="1440" w:hanging="360"/>
       </w:pPr>
     </w:lvl>
     <w:lvl w:ilvl="2">
@@ -552,10 +1254,7 @@
       <w:lvlText w:val=" "/>
       <w:lvlJc w:val="left"/>
       <w:pPr>
-        <w:tabs>
-          <w:tab w:val="num" w:pos="1440"/>
-        </w:tabs>
-        <w:ind w:left="1920" w:hanging="480"/>
+        <w:ind w:left="2160" w:hanging="360"/>
       </w:pPr>
     </w:lvl>
     <w:lvl w:ilvl="3">
@@ -563,10 +1262,7 @@
       <w:lvlText w:val=" "/>
       <w:lvlJc w:val="left"/>
       <w:pPr>
-        <w:tabs>
-          <w:tab w:val="num" w:pos="2160"/>
-        </w:tabs>
-        <w:ind w:left="2640" w:hanging="480"/>
+        <w:ind w:left="2880" w:hanging="360"/>
       </w:pPr>
     </w:lvl>
     <w:lvl w:ilvl="4">
@@ -574,10 +1270,7 @@
       <w:lvlText w:val=" "/>
       <w:lvlJc w:val="left"/>
       <w:pPr>
-        <w:tabs>
-          <w:tab w:val="num" w:pos="2880"/>
-        </w:tabs>
-        <w:ind w:left="3360" w:hanging="480"/>
+        <w:ind w:left="3600" w:hanging="360"/>
       </w:pPr>
     </w:lvl>
     <w:lvl w:ilvl="5">
@@ -585,10 +1278,7 @@
       <w:lvlText w:val=" "/>
       <w:lvlJc w:val="left"/>
       <w:pPr>
-        <w:tabs>
-          <w:tab w:val="num" w:pos="3600"/>
-        </w:tabs>
-        <w:ind w:left="4080" w:hanging="480"/>
+        <w:ind w:left="4320" w:hanging="360"/>
       </w:pPr>
     </w:lvl>
     <w:lvl w:ilvl="6">
@@ -596,10 +1286,7 @@
       <w:lvlText w:val=" "/>
       <w:lvlJc w:val="left"/>
       <w:pPr>
-        <w:tabs>
-          <w:tab w:val="num" w:pos="4320"/>
-        </w:tabs>
-        <w:ind w:left="4800" w:hanging="480"/>
+        <w:ind w:left="5040" w:hanging="360"/>
       </w:pPr>
     </w:lvl>
     <w:lvl w:ilvl="7">
@@ -607,10 +1294,7 @@
       <w:lvlText w:val=" "/>
       <w:lvlJc w:val="left"/>
       <w:pPr>
-        <w:tabs>
-          <w:tab w:val="num" w:pos="5040"/>
-        </w:tabs>
-        <w:ind w:left="5520" w:hanging="480"/>
+        <w:ind w:left="5760" w:hanging="360"/>
       </w:pPr>
     </w:lvl>
     <w:lvl w:ilvl="8">
@@ -618,15 +1302,118 @@
       <w:lvlText w:val=" "/>
       <w:lvlJc w:val="left"/>
       <w:pPr>
-        <w:tabs>
-          <w:tab w:val="num" w:pos="5760"/>
-        </w:tabs>
-        <w:ind w:left="6240" w:hanging="480"/>
-      </w:pPr>
+        <w:ind w:left="6480" w:hanging="360"/>
+      </w:pPr>
+    </w:lvl>
+  </w:abstractNum>
+  <w:abstractNum w:abstractNumId="991">
+    <w:nsid w:val="0000A991"/>
+    <w:multiLevelType w:val="multilevel"/>
+    <w:lvl w:ilvl="0">
+      <w:numFmt w:val="bullet"/>
+      <w:lvlText w:val=""/>
+      <w:lvlJc w:val="left"/>
+      <w:pPr>
+        <w:ind w:left="720" w:hanging="360"/>
+      </w:pPr>
+      <w:rPr>
+        <w:rFonts w:ascii="Symbol" w:hAnsi="Symbol" w:cs="Symbol" w:hint="default"/>
+      </w:rPr>
+    </w:lvl>
+    <w:lvl w:ilvl="1">
+      <w:numFmt w:val="bullet"/>
+      <w:lvlText w:val="o"/>
+      <w:lvlJc w:val="left"/>
+      <w:pPr>
+        <w:ind w:left="1440" w:hanging="360"/>
+      </w:pPr>
+      <w:rPr>
+        <w:rFonts w:ascii="Courier New" w:hAnsi="Courier New" w:cs="Courier New" w:hint="default"/>
+      </w:rPr>
+    </w:lvl>
+    <w:lvl w:ilvl="2">
+      <w:numFmt w:val="bullet"/>
+      <w:lvlText w:val=""/>
+      <w:lvlJc w:val="left"/>
+      <w:pPr>
+        <w:ind w:left="2160" w:hanging="360"/>
+      </w:pPr>
+      <w:rPr>
+        <w:rFonts w:ascii="Wingdings" w:hAnsi="Wingdings" w:cs="Wingdings" w:hint="default"/>
+      </w:rPr>
+    </w:lvl>
+    <w:lvl w:ilvl="3">
+      <w:numFmt w:val="bullet"/>
+      <w:lvlText w:val=""/>
+      <w:lvlJc w:val="left"/>
+      <w:pPr>
+        <w:ind w:left="2880" w:hanging="360"/>
+      </w:pPr>
+      <w:rPr>
+        <w:rFonts w:ascii="Symbol" w:hAnsi="Symbol" w:cs="Symbol" w:hint="default"/>
+      </w:rPr>
+    </w:lvl>
+    <w:lvl w:ilvl="4">
+      <w:numFmt w:val="bullet"/>
+      <w:lvlText w:val="o"/>
+      <w:lvlJc w:val="left"/>
+      <w:pPr>
+        <w:ind w:left="3600" w:hanging="360"/>
+      </w:pPr>
+      <w:rPr>
+        <w:rFonts w:ascii="Courier New" w:hAnsi="Courier New" w:cs="Courier New" w:hint="default"/>
+      </w:rPr>
+    </w:lvl>
+    <w:lvl w:ilvl="5">
+      <w:numFmt w:val="bullet"/>
+      <w:lvlText w:val=""/>
+      <w:lvlJc w:val="left"/>
+      <w:pPr>
+        <w:ind w:left="4320" w:hanging="360"/>
+      </w:pPr>
+      <w:rPr>
+        <w:rFonts w:ascii="Wingdings" w:hAnsi="Wingdings" w:cs="Wingdings" w:hint="default"/>
+      </w:rPr>
+    </w:lvl>
+    <w:lvl w:ilvl="6">
+      <w:numFmt w:val="bullet"/>
+      <w:lvlText w:val=""/>
+      <w:lvlJc w:val="left"/>
+      <w:pPr>
+        <w:ind w:left="5040" w:hanging="360"/>
+      </w:pPr>
+      <w:rPr>
+        <w:rFonts w:ascii="Symbol" w:hAnsi="Symbol" w:cs="Symbol" w:hint="default"/>
+      </w:rPr>
+    </w:lvl>
+    <w:lvl w:ilvl="7">
+      <w:numFmt w:val="bullet"/>
+      <w:lvlText w:val="o"/>
+      <w:lvlJc w:val="left"/>
+      <w:pPr>
+        <w:ind w:left="5760" w:hanging="360"/>
+      </w:pPr>
+      <w:rPr>
+        <w:rFonts w:ascii="Courier New" w:hAnsi="Courier New" w:cs="Courier New" w:hint="default"/>
+      </w:rPr>
+    </w:lvl>
+    <w:lvl w:ilvl="8">
+      <w:numFmt w:val="bullet"/>
+      <w:lvlText w:val=""/>
+      <w:lvlJc w:val="left"/>
+      <w:pPr>
+        <w:ind w:left="6480" w:hanging="360"/>
+      </w:pPr>
+      <w:rPr>
+        <w:rFonts w:ascii="Wingdings" w:hAnsi="Wingdings" w:cs="Wingdings" w:hint="default"/>
+      </w:rPr>
     </w:lvl>
   </w:abstractNum>
   <w:num w:numId="1000">
     <w:abstractNumId w:val="990"/>
+  </w:num>
+  <w:num w:numId="1001">
+    <w:abstractNumId w:val="991"/>
   </w:num>
 </w:numbering>
 </file>
@@ -636,11 +1423,11 @@
   <w:docDefaults>
     <w:rPrDefault>
       <w:rPr>
-        <w:rFonts w:ascii="Open Sans" w:hAnsi="Open Sans" w:eastAsia="Open Sans" w:cs="Open Sans"/>
+        <w:rFonts w:ascii="Open Sans" w:cs="Open Sans" w:eastAsia="Open Sans" w:hAnsi="Open Sans"/>
         <w:color w:val="2B2B2B"/>
         <w:sz w:val="19"/>
         <w:szCs w:val="19"/>
-        <w:lang w:val="en-US" w:eastAsia="zh-CN" w:bidi="ar-SA"/>
+        <w:lang w:bidi="ar-SA" w:eastAsia="zh-CN" w:val="en-US"/>
       </w:rPr>
     </w:rPrDefault>
     <w:pPrDefault>
@@ -649,35 +1436,35 @@
       </w:pPr>
     </w:pPrDefault>
   </w:docDefaults>
-  <w:latentStyles w:defLockedState="0" w:defUIPriority="0" w:defSemiHidden="0" w:defUnhideWhenUsed="0" w:defQFormat="0" w:count="276"/>
-  <w:style w:type="paragraph" w:default="1" w:styleId="Normal">
+  <w:latentStyles w:count="276" w:defLockedState="0" w:defQFormat="0" w:defSemiHidden="0" w:defUIPriority="0" w:defUnhideWhenUsed="0"/>
+  <w:style w:default="1" w:styleId="Normal" w:type="paragraph">
     <w:name w:val="Normal"/>
     <w:qFormat/>
   </w:style>
-  <w:style w:type="paragraph" w:styleId="BodyText">
+  <w:style w:styleId="BodyText" w:type="paragraph">
     <w:name w:val="Body Text"/>
     <w:basedOn w:val="Normal"/>
     <w:link w:val="BodyTextChar"/>
     <w:qFormat/>
     <w:pPr>
-      <w:spacing w:before="180" w:after="180"/>
-    </w:pPr>
-  </w:style>
-  <w:style w:type="paragraph" w:customStyle="1" w:styleId="FirstParagraph">
+      <w:spacing w:after="180" w:before="180"/>
+    </w:pPr>
+  </w:style>
+  <w:style w:customStyle="1" w:styleId="FirstParagraph" w:type="paragraph">
     <w:name w:val="First Paragraph"/>
     <w:basedOn w:val="BodyText"/>
     <w:next w:val="BodyText"/>
     <w:qFormat/>
   </w:style>
-  <w:style w:type="paragraph" w:customStyle="1" w:styleId="Compact">
+  <w:style w:customStyle="1" w:styleId="Compact" w:type="paragraph">
     <w:name w:val="Compact"/>
     <w:basedOn w:val="BodyText"/>
     <w:qFormat/>
     <w:pPr>
-      <w:spacing w:before="36" w:after="36"/>
-    </w:pPr>
-  </w:style>
-  <w:style w:type="paragraph" w:styleId="Title">
+      <w:spacing w:after="36" w:before="36"/>
+    </w:pPr>
+  </w:style>
+  <w:style w:styleId="Title" w:type="paragraph">
     <w:name w:val="Title"/>
     <w:basedOn w:val="Normal"/>
     <w:next w:val="BodyText"/>
@@ -691,7 +1478,7 @@
       <w:jc w:val="center"/>
     </w:pPr>
     <w:rPr>
-      <w:rFonts w:ascii="Montserrat" w:hAnsi="Montserrat" w:eastAsia="Montserrat" w:cs="Montserrat"/>
+      <w:rFonts w:ascii="Montserrat" w:cs="Montserrat" w:eastAsia="Montserrat" w:hAnsi="Montserrat"/>
       <w:b/>
       <w:bCs/>
       <w:color w:val="1356CF"/>
@@ -699,19 +1486,19 @@
       <w:szCs w:val="40"/>
     </w:rPr>
   </w:style>
-  <w:style w:type="character" w:customStyle="1" w:styleId="TitleChar">
+  <w:style w:customStyle="1" w:styleId="TitleChar" w:type="character">
     <w:name w:val="Title Char"/>
     <w:basedOn w:val="DefaultParagraphFont"/>
     <w:link w:val="Title"/>
     <w:uiPriority w:val="10"/>
     <w:rsid w:val="00A10FD9"/>
     <w:rPr>
-      <w:rFonts w:asciiTheme="majorHAnsi" w:eastAsiaTheme="majorEastAsia" w:hAnsiTheme="majorHAnsi" w:cstheme="majorBidi"/>
+      <w:rFonts w:asciiTheme="majorHAnsi" w:cstheme="majorBidi" w:eastAsiaTheme="majorEastAsia" w:hAnsiTheme="majorHAnsi"/>
       <w:sz w:val="56"/>
       <w:szCs w:val="56"/>
     </w:rPr>
   </w:style>
-  <w:style w:type="paragraph" w:styleId="Subtitle">
+  <w:style w:styleId="Subtitle" w:type="paragraph">
     <w:name w:val="Subtitle"/>
     <w:basedOn w:val="Title"/>
     <w:next w:val="BodyText"/>
@@ -725,27 +1512,27 @@
       </w:numPr>
     </w:pPr>
     <w:rPr>
-      <w:rFonts w:eastAsiaTheme="majorEastAsia" w:cstheme="majorBidi"/>
+      <w:rFonts w:cstheme="majorBidi" w:eastAsiaTheme="majorEastAsia"/>
       <w:spacing w:val="15"/>
       <w:sz w:val="28"/>
       <w:szCs w:val="28"/>
     </w:rPr>
   </w:style>
-  <w:style w:type="character" w:customStyle="1" w:styleId="SubtitleChar">
+  <w:style w:customStyle="1" w:styleId="SubtitleChar" w:type="character">
     <w:name w:val="Subtitle Char"/>
     <w:basedOn w:val="DefaultParagraphFont"/>
     <w:link w:val="Subtitle"/>
     <w:uiPriority w:val="11"/>
     <w:rsid w:val="00A10FD9"/>
     <w:rPr>
-      <w:rFonts w:eastAsiaTheme="majorEastAsia" w:cstheme="majorBidi"/>
-      <w:color w:val="595959" w:themeColor="text1" w:themeTint="A6"/>
+      <w:rFonts w:cstheme="majorBidi" w:eastAsiaTheme="majorEastAsia"/>
+      <w:color w:themeColor="text1" w:themeTint="A6" w:val="595959"/>
       <w:spacing w:val="15"/>
       <w:sz w:val="28"/>
       <w:szCs w:val="28"/>
     </w:rPr>
   </w:style>
-  <w:style w:type="paragraph" w:customStyle="1" w:styleId="Author">
+  <w:style w:customStyle="1" w:styleId="Author" w:type="paragraph">
     <w:name w:val="Author"/>
     <w:basedOn w:val="Title"/>
     <w:next w:val="BodyText"/>
@@ -759,7 +1546,7 @@
       <w:szCs w:val="24"/>
     </w:rPr>
   </w:style>
-  <w:style w:type="paragraph" w:styleId="Date">
+  <w:style w:styleId="Date" w:type="paragraph">
     <w:name w:val="Date"/>
     <w:basedOn w:val="Title"/>
     <w:next w:val="BodyText"/>
@@ -773,7 +1560,7 @@
       <w:szCs w:val="24"/>
     </w:rPr>
   </w:style>
-  <w:style w:type="paragraph" w:customStyle="1" w:styleId="AbstractTitle">
+  <w:style w:customStyle="1" w:styleId="AbstractTitle" w:type="paragraph">
     <w:name w:val="Abstract Title"/>
     <w:basedOn w:val="Normal"/>
     <w:next w:val="Abstract"/>
@@ -781,7 +1568,7 @@
     <w:pPr>
       <w:keepNext/>
       <w:keepLines/>
-      <w:spacing w:before="300" w:after="0"/>
+      <w:spacing w:after="0" w:before="300"/>
       <w:jc w:val="center"/>
     </w:pPr>
     <w:rPr>
@@ -790,7 +1577,7 @@
       <w:szCs w:val="20"/>
     </w:rPr>
   </w:style>
-  <w:style w:type="paragraph" w:customStyle="1" w:styleId="Abstract">
+  <w:style w:customStyle="1" w:styleId="Abstract" w:type="paragraph">
     <w:name w:val="Abstract"/>
     <w:basedOn w:val="Normal"/>
     <w:next w:val="BodyText"/>
@@ -798,14 +1585,14 @@
     <w:pPr>
       <w:keepNext/>
       <w:keepLines/>
-      <w:spacing w:before="100" w:after="300"/>
+      <w:spacing w:after="300" w:before="100"/>
     </w:pPr>
     <w:rPr>
       <w:sz w:val="20"/>
       <w:szCs w:val="20"/>
     </w:rPr>
   </w:style>
-  <w:style w:type="paragraph" w:styleId="Bibliography">
+  <w:style w:styleId="Bibliography" w:type="paragraph">
     <w:name w:val="Bibliography"/>
     <w:basedOn w:val="Normal"/>
     <w:next w:val="Bibliography"/>
@@ -813,7 +1600,7 @@
     <w:pPr/>
     <w:rPr/>
   </w:style>
-  <w:style w:type="paragraph" w:styleId="Heading1">
+  <w:style w:styleId="Heading1" w:type="paragraph">
     <w:name w:val="heading 1"/>
     <w:basedOn w:val="Normal"/>
     <w:next w:val="BodyText"/>
@@ -824,14 +1611,14 @@
     <w:pPr>
       <w:keepNext/>
       <w:keepLines/>
-      <w:spacing w:before="360" w:after="80"/>
+      <w:spacing w:after="80" w:before="360"/>
       <w:outlineLvl w:val="0"/>
       <w:pBdr>
-        <w:bottom w:val="single" w:sz="8" w:space="4" w:color="1356CF"/>
+        <w:bottom w:color="1356CF" w:space="4" w:sz="8" w:val="single"/>
       </w:pBdr>
     </w:pPr>
     <w:rPr>
-      <w:rFonts w:ascii="Montserrat" w:hAnsi="Montserrat" w:eastAsia="Montserrat" w:cs="Montserrat"/>
+      <w:rFonts w:ascii="Montserrat" w:cs="Montserrat" w:eastAsia="Montserrat" w:hAnsi="Montserrat"/>
       <w:b/>
       <w:bCs/>
       <w:color w:val="1356CF"/>
@@ -839,7 +1626,7 @@
       <w:szCs w:val="32"/>
     </w:rPr>
   </w:style>
-  <w:style w:type="paragraph" w:styleId="Heading2">
+  <w:style w:styleId="Heading2" w:type="paragraph">
     <w:name w:val="heading 2"/>
     <w:basedOn w:val="Normal"/>
     <w:next w:val="BodyText"/>
@@ -852,11 +1639,11 @@
     <w:pPr>
       <w:keepNext/>
       <w:keepLines/>
-      <w:spacing w:before="160" w:after="80"/>
+      <w:spacing w:after="80" w:before="160"/>
       <w:outlineLvl w:val="1"/>
     </w:pPr>
     <w:rPr>
-      <w:rFonts w:ascii="Montserrat" w:hAnsi="Montserrat" w:eastAsia="Montserrat" w:cs="Montserrat"/>
+      <w:rFonts w:ascii="Montserrat" w:cs="Montserrat" w:eastAsia="Montserrat" w:hAnsi="Montserrat"/>
       <w:b/>
       <w:bCs/>
       <w:color w:val="2B2B2B"/>
@@ -864,7 +1651,7 @@
       <w:szCs w:val="24"/>
     </w:rPr>
   </w:style>
-  <w:style w:type="paragraph" w:styleId="Heading3">
+  <w:style w:styleId="Heading3" w:type="paragraph">
     <w:name w:val="heading 3"/>
     <w:basedOn w:val="Normal"/>
     <w:next w:val="BodyText"/>
@@ -877,11 +1664,11 @@
     <w:pPr>
       <w:keepNext/>
       <w:keepLines/>
-      <w:spacing w:before="160" w:after="80"/>
+      <w:spacing w:after="80" w:before="160"/>
       <w:outlineLvl w:val="2"/>
     </w:pPr>
     <w:rPr>
-      <w:rFonts w:ascii="Montserrat" w:hAnsi="Montserrat" w:eastAsia="Montserrat" w:cs="Montserrat"/>
+      <w:rFonts w:ascii="Montserrat" w:cs="Montserrat" w:eastAsia="Montserrat" w:hAnsi="Montserrat"/>
       <w:b/>
       <w:bCs/>
       <w:color w:val="2B2B2B"/>
@@ -889,7 +1676,7 @@
       <w:szCs w:val="21"/>
     </w:rPr>
   </w:style>
-  <w:style w:type="paragraph" w:styleId="Heading4">
+  <w:style w:styleId="Heading4" w:type="paragraph">
     <w:name w:val="heading 4"/>
     <w:basedOn w:val="Normal"/>
     <w:next w:val="BodyText"/>
@@ -902,11 +1689,11 @@
     <w:pPr>
       <w:keepNext/>
       <w:keepLines/>
-      <w:spacing w:before="80" w:after="40"/>
+      <w:spacing w:after="40" w:before="80"/>
       <w:outlineLvl w:val="3"/>
     </w:pPr>
     <w:rPr>
-      <w:rFonts w:ascii="Montserrat" w:hAnsi="Montserrat" w:eastAsia="Montserrat" w:cs="Montserrat"/>
+      <w:rFonts w:ascii="Montserrat" w:cs="Montserrat" w:eastAsia="Montserrat" w:hAnsi="Montserrat"/>
       <w:b/>
       <w:bCs/>
       <w:color w:val="2B2B2B"/>
@@ -914,7 +1701,7 @@
       <w:szCs w:val="19"/>
     </w:rPr>
   </w:style>
-  <w:style w:type="paragraph" w:styleId="Heading5">
+  <w:style w:styleId="Heading5" w:type="paragraph">
     <w:name w:val="heading 5"/>
     <w:basedOn w:val="Normal"/>
     <w:next w:val="BodyText"/>
@@ -927,15 +1714,15 @@
     <w:pPr>
       <w:keepNext/>
       <w:keepLines/>
-      <w:spacing w:before="80" w:after="40"/>
+      <w:spacing w:after="40" w:before="80"/>
       <w:outlineLvl w:val="4"/>
     </w:pPr>
     <w:rPr>
-      <w:rFonts w:eastAsiaTheme="majorEastAsia" w:cstheme="majorBidi"/>
-      <w:color w:val="0F4761" w:themeColor="accent1" w:themeShade="BF"/>
-    </w:rPr>
-  </w:style>
-  <w:style w:type="paragraph" w:styleId="Heading6">
+      <w:rFonts w:cstheme="majorBidi" w:eastAsiaTheme="majorEastAsia"/>
+      <w:color w:themeColor="accent1" w:themeShade="BF" w:val="0F4761"/>
+    </w:rPr>
+  </w:style>
+  <w:style w:styleId="Heading6" w:type="paragraph">
     <w:name w:val="heading 6"/>
     <w:basedOn w:val="Normal"/>
     <w:next w:val="BodyText"/>
@@ -948,17 +1735,17 @@
     <w:pPr>
       <w:keepNext/>
       <w:keepLines/>
-      <w:spacing w:before="40" w:after="0"/>
+      <w:spacing w:after="0" w:before="40"/>
       <w:outlineLvl w:val="5"/>
     </w:pPr>
     <w:rPr>
-      <w:rFonts w:eastAsiaTheme="majorEastAsia" w:cstheme="majorBidi"/>
+      <w:rFonts w:cstheme="majorBidi" w:eastAsiaTheme="majorEastAsia"/>
       <w:i/>
       <w:iCs/>
-      <w:color w:val="595959" w:themeColor="text1" w:themeTint="A6"/>
-    </w:rPr>
-  </w:style>
-  <w:style w:type="paragraph" w:styleId="Heading7">
+      <w:color w:themeColor="text1" w:themeTint="A6" w:val="595959"/>
+    </w:rPr>
+  </w:style>
+  <w:style w:styleId="Heading7" w:type="paragraph">
     <w:name w:val="heading 7"/>
     <w:basedOn w:val="Normal"/>
     <w:next w:val="BodyText"/>
@@ -971,15 +1758,15 @@
     <w:pPr>
       <w:keepNext/>
       <w:keepLines/>
-      <w:spacing w:before="40" w:after="0"/>
+      <w:spacing w:after="0" w:before="40"/>
       <w:outlineLvl w:val="6"/>
     </w:pPr>
     <w:rPr>
-      <w:rFonts w:eastAsiaTheme="majorEastAsia" w:cstheme="majorBidi"/>
-      <w:color w:val="595959" w:themeColor="text1" w:themeTint="A6"/>
-    </w:rPr>
-  </w:style>
-  <w:style w:type="paragraph" w:styleId="Heading8">
+      <w:rFonts w:cstheme="majorBidi" w:eastAsiaTheme="majorEastAsia"/>
+      <w:color w:themeColor="text1" w:themeTint="A6" w:val="595959"/>
+    </w:rPr>
+  </w:style>
+  <w:style w:styleId="Heading8" w:type="paragraph">
     <w:name w:val="heading 8"/>
     <w:basedOn w:val="Normal"/>
     <w:next w:val="BodyText"/>
@@ -996,13 +1783,13 @@
       <w:outlineLvl w:val="7"/>
     </w:pPr>
     <w:rPr>
-      <w:rFonts w:eastAsiaTheme="majorEastAsia" w:cstheme="majorBidi"/>
+      <w:rFonts w:cstheme="majorBidi" w:eastAsiaTheme="majorEastAsia"/>
       <w:i/>
       <w:iCs/>
-      <w:color w:val="272727" w:themeColor="text1" w:themeTint="D8"/>
-    </w:rPr>
-  </w:style>
-  <w:style w:type="paragraph" w:styleId="Heading9">
+      <w:color w:themeColor="text1" w:themeTint="D8" w:val="272727"/>
+    </w:rPr>
+  </w:style>
+  <w:style w:styleId="Heading9" w:type="paragraph">
     <w:name w:val="heading 9"/>
     <w:basedOn w:val="Normal"/>
     <w:next w:val="BodyText"/>
@@ -1019,24 +1806,24 @@
       <w:outlineLvl w:val="8"/>
     </w:pPr>
     <w:rPr>
-      <w:rFonts w:eastAsiaTheme="majorEastAsia" w:cstheme="majorBidi"/>
-      <w:color w:val="272727" w:themeColor="text1" w:themeTint="D8"/>
-    </w:rPr>
-  </w:style>
-  <w:style w:type="character" w:customStyle="1" w:styleId="Heading1Char">
+      <w:rFonts w:cstheme="majorBidi" w:eastAsiaTheme="majorEastAsia"/>
+      <w:color w:themeColor="text1" w:themeTint="D8" w:val="272727"/>
+    </w:rPr>
+  </w:style>
+  <w:style w:customStyle="1" w:styleId="Heading1Char" w:type="character">
     <w:name w:val="Heading 1 Char"/>
     <w:basedOn w:val="DefaultParagraphFont"/>
     <w:link w:val="Heading1"/>
     <w:uiPriority w:val="9"/>
     <w:rsid w:val="00A10FD9"/>
     <w:rPr>
-      <w:rFonts w:asciiTheme="majorHAnsi" w:eastAsiaTheme="majorEastAsia" w:hAnsiTheme="majorHAnsi" w:cstheme="majorBidi"/>
-      <w:color w:val="0F4761" w:themeColor="accent1" w:themeShade="BF"/>
+      <w:rFonts w:asciiTheme="majorHAnsi" w:cstheme="majorBidi" w:eastAsiaTheme="majorEastAsia" w:hAnsiTheme="majorHAnsi"/>
+      <w:color w:themeColor="accent1" w:themeShade="BF" w:val="0F4761"/>
       <w:sz w:val="40"/>
       <w:szCs w:val="40"/>
     </w:rPr>
   </w:style>
-  <w:style w:type="character" w:customStyle="1" w:styleId="Heading2Char">
+  <w:style w:customStyle="1" w:styleId="Heading2Char" w:type="character">
     <w:name w:val="Heading 2 Char"/>
     <w:basedOn w:val="DefaultParagraphFont"/>
     <w:link w:val="Heading2"/>
@@ -1044,13 +1831,13 @@
     <w:semiHidden/>
     <w:rsid w:val="00A10FD9"/>
     <w:rPr>
-      <w:rFonts w:asciiTheme="majorHAnsi" w:eastAsiaTheme="majorEastAsia" w:hAnsiTheme="majorHAnsi" w:cstheme="majorBidi"/>
-      <w:color w:val="0F4761" w:themeColor="accent1" w:themeShade="BF"/>
+      <w:rFonts w:asciiTheme="majorHAnsi" w:cstheme="majorBidi" w:eastAsiaTheme="majorEastAsia" w:hAnsiTheme="majorHAnsi"/>
+      <w:color w:themeColor="accent1" w:themeShade="BF" w:val="0F4761"/>
       <w:sz w:val="32"/>
       <w:szCs w:val="32"/>
     </w:rPr>
   </w:style>
-  <w:style w:type="character" w:customStyle="1" w:styleId="Heading3Char">
+  <w:style w:customStyle="1" w:styleId="Heading3Char" w:type="character">
     <w:name w:val="Heading 3 Char"/>
     <w:basedOn w:val="DefaultParagraphFont"/>
     <w:link w:val="Heading3"/>
@@ -1058,13 +1845,13 @@
     <w:semiHidden/>
     <w:rsid w:val="00A10FD9"/>
     <w:rPr>
-      <w:rFonts w:eastAsiaTheme="majorEastAsia" w:cstheme="majorBidi"/>
-      <w:color w:val="0F4761" w:themeColor="accent1" w:themeShade="BF"/>
+      <w:rFonts w:cstheme="majorBidi" w:eastAsiaTheme="majorEastAsia"/>
+      <w:color w:themeColor="accent1" w:themeShade="BF" w:val="0F4761"/>
       <w:sz w:val="28"/>
       <w:szCs w:val="28"/>
     </w:rPr>
   </w:style>
-  <w:style w:type="character" w:customStyle="1" w:styleId="Heading4Char">
+  <w:style w:customStyle="1" w:styleId="Heading4Char" w:type="character">
     <w:name w:val="Heading 4 Char"/>
     <w:basedOn w:val="DefaultParagraphFont"/>
     <w:link w:val="Heading4"/>
@@ -1072,13 +1859,13 @@
     <w:semiHidden/>
     <w:rsid w:val="00A10FD9"/>
     <w:rPr>
-      <w:rFonts w:eastAsiaTheme="majorEastAsia" w:cstheme="majorBidi"/>
+      <w:rFonts w:cstheme="majorBidi" w:eastAsiaTheme="majorEastAsia"/>
       <w:i/>
       <w:iCs/>
-      <w:color w:val="0F4761" w:themeColor="accent1" w:themeShade="BF"/>
-    </w:rPr>
-  </w:style>
-  <w:style w:type="character" w:customStyle="1" w:styleId="Heading5Char">
+      <w:color w:themeColor="accent1" w:themeShade="BF" w:val="0F4761"/>
+    </w:rPr>
+  </w:style>
+  <w:style w:customStyle="1" w:styleId="Heading5Char" w:type="character">
     <w:name w:val="Heading 5 Char"/>
     <w:basedOn w:val="DefaultParagraphFont"/>
     <w:link w:val="Heading5"/>
@@ -1086,11 +1873,11 @@
     <w:semiHidden/>
     <w:rsid w:val="00A10FD9"/>
     <w:rPr>
-      <w:rFonts w:eastAsiaTheme="majorEastAsia" w:cstheme="majorBidi"/>
-      <w:color w:val="0F4761" w:themeColor="accent1" w:themeShade="BF"/>
-    </w:rPr>
-  </w:style>
-  <w:style w:type="character" w:customStyle="1" w:styleId="Heading6Char">
+      <w:rFonts w:cstheme="majorBidi" w:eastAsiaTheme="majorEastAsia"/>
+      <w:color w:themeColor="accent1" w:themeShade="BF" w:val="0F4761"/>
+    </w:rPr>
+  </w:style>
+  <w:style w:customStyle="1" w:styleId="Heading6Char" w:type="character">
     <w:name w:val="Heading 6 Char"/>
     <w:basedOn w:val="DefaultParagraphFont"/>
     <w:link w:val="Heading6"/>
@@ -1098,13 +1885,13 @@
     <w:semiHidden/>
     <w:rsid w:val="00A10FD9"/>
     <w:rPr>
-      <w:rFonts w:eastAsiaTheme="majorEastAsia" w:cstheme="majorBidi"/>
+      <w:rFonts w:cstheme="majorBidi" w:eastAsiaTheme="majorEastAsia"/>
       <w:i/>
       <w:iCs/>
-      <w:color w:val="595959" w:themeColor="text1" w:themeTint="A6"/>
-    </w:rPr>
-  </w:style>
-  <w:style w:type="character" w:customStyle="1" w:styleId="Heading7Char">
+      <w:color w:themeColor="text1" w:themeTint="A6" w:val="595959"/>
+    </w:rPr>
+  </w:style>
+  <w:style w:customStyle="1" w:styleId="Heading7Char" w:type="character">
     <w:name w:val="Heading 7 Char"/>
     <w:basedOn w:val="DefaultParagraphFont"/>
     <w:link w:val="Heading7"/>
@@ -1112,11 +1899,11 @@
     <w:semiHidden/>
     <w:rsid w:val="00A10FD9"/>
     <w:rPr>
-      <w:rFonts w:eastAsiaTheme="majorEastAsia" w:cstheme="majorBidi"/>
-      <w:color w:val="595959" w:themeColor="text1" w:themeTint="A6"/>
-    </w:rPr>
-  </w:style>
-  <w:style w:type="character" w:customStyle="1" w:styleId="Heading8Char">
+      <w:rFonts w:cstheme="majorBidi" w:eastAsiaTheme="majorEastAsia"/>
+      <w:color w:themeColor="text1" w:themeTint="A6" w:val="595959"/>
+    </w:rPr>
+  </w:style>
+  <w:style w:customStyle="1" w:styleId="Heading8Char" w:type="character">
     <w:name w:val="Heading 8 Char"/>
     <w:basedOn w:val="DefaultParagraphFont"/>
     <w:link w:val="Heading8"/>
@@ -1124,13 +1911,13 @@
     <w:semiHidden/>
     <w:rsid w:val="00A10FD9"/>
     <w:rPr>
-      <w:rFonts w:eastAsiaTheme="majorEastAsia" w:cstheme="majorBidi"/>
+      <w:rFonts w:cstheme="majorBidi" w:eastAsiaTheme="majorEastAsia"/>
       <w:i/>
       <w:iCs/>
-      <w:color w:val="272727" w:themeColor="text1" w:themeTint="D8"/>
-    </w:rPr>
-  </w:style>
-  <w:style w:type="character" w:customStyle="1" w:styleId="Heading9Char">
+      <w:color w:themeColor="text1" w:themeTint="D8" w:val="272727"/>
+    </w:rPr>
+  </w:style>
+  <w:style w:customStyle="1" w:styleId="Heading9Char" w:type="character">
     <w:name w:val="Heading 9 Char"/>
     <w:basedOn w:val="DefaultParagraphFont"/>
     <w:link w:val="Heading9"/>
@@ -1138,11 +1925,11 @@
     <w:semiHidden/>
     <w:rsid w:val="00A10FD9"/>
     <w:rPr>
-      <w:rFonts w:eastAsiaTheme="majorEastAsia" w:cstheme="majorBidi"/>
-      <w:color w:val="272727" w:themeColor="text1" w:themeTint="D8"/>
-    </w:rPr>
-  </w:style>
-  <w:style w:type="paragraph" w:styleId="BlockText">
+      <w:rFonts w:cstheme="majorBidi" w:eastAsiaTheme="majorEastAsia"/>
+      <w:color w:themeColor="text1" w:themeTint="D8" w:val="272727"/>
+    </w:rPr>
+  </w:style>
+  <w:style w:styleId="BlockText" w:type="paragraph">
     <w:name w:val="Block Text"/>
     <w:basedOn w:val="BodyText"/>
     <w:next w:val="BodyText"/>
@@ -1150,11 +1937,11 @@
     <w:unhideWhenUsed/>
     <w:qFormat/>
     <w:pPr>
-      <w:spacing w:before="100" w:after="100"/>
+      <w:spacing w:after="100" w:before="100"/>
       <w:ind w:firstLine="0" w:left="480" w:right="480"/>
     </w:pPr>
   </w:style>
-  <w:style w:type="paragraph" w:styleId="FootnoteText">
+  <w:style w:styleId="FootnoteText" w:type="paragraph">
     <w:name w:val="Footnote Text"/>
     <w:basedOn w:val="Normal"/>
     <w:next w:val="FootnoteText"/>
@@ -1162,7 +1949,7 @@
     <w:unhideWhenUsed/>
     <w:qFormat/>
   </w:style>
-  <w:style w:type="paragraph" w:styleId="FootnoteBlockText">
+  <w:style w:styleId="FootnoteBlockText" w:type="paragraph">
     <w:name w:val="Footnote Block Text"/>
     <w:basedOn w:val="FootnoteText"/>
     <w:next w:val="FootnoteText"/>
@@ -1170,28 +1957,28 @@
     <w:unhideWhenUsed/>
     <w:qFormat/>
     <w:pPr>
-      <w:spacing w:before="100" w:after="100"/>
+      <w:spacing w:after="100" w:before="100"/>
       <w:ind w:firstLine="0" w:left="480" w:right="480"/>
     </w:pPr>
   </w:style>
-  <w:style w:type="character" w:default="1" w:styleId="DefaultParagraphFont">
+  <w:style w:default="1" w:styleId="DefaultParagraphFont" w:type="character">
     <w:name w:val="Default Paragraph Font"/>
     <w:semiHidden/>
     <w:unhideWhenUsed/>
   </w:style>
-  <w:style w:type="table" w:default="1" w:styleId="Table">
+  <w:style w:default="1" w:styleId="Table" w:type="table">
     <w:name w:val="Table"/>
     <w:basedOn w:val="TableNormal"/>
     <w:semiHidden/>
     <w:unhideWhenUsed/>
     <w:qFormat/>
     <w:tblPr>
-      <w:tblInd w:w="0" w:type="dxa"/>
+      <w:tblInd w:type="dxa" w:w="0"/>
       <w:tblCellMar>
-        <w:top w:w="0" w:type="dxa"/>
-        <w:left w:w="108" w:type="dxa"/>
-        <w:bottom w:w="0" w:type="dxa"/>
-        <w:right w:w="108" w:type="dxa"/>
+        <w:top w:type="dxa" w:w="0"/>
+        <w:left w:type="dxa" w:w="108"/>
+        <w:bottom w:type="dxa" w:w="0"/>
+        <w:right w:type="dxa" w:w="108"/>
       </w:tblCellMar>
     </w:tblPr>
     <w:tblStylePr w:type="firstRow">
@@ -1203,7 +1990,7 @@
       </w:tcPr>
     </w:tblStylePr>
   </w:style>
-  <w:style w:type="paragraph" w:customStyle="1" w:styleId="DefinitionTerm">
+  <w:style w:customStyle="1" w:styleId="DefinitionTerm" w:type="paragraph">
     <w:name w:val="Definition Term"/>
     <w:basedOn w:val="Normal"/>
     <w:next w:val="Definition"/>
@@ -1216,69 +2003,69 @@
       <w:b/>
     </w:rPr>
   </w:style>
-  <w:style w:type="paragraph" w:customStyle="1" w:styleId="Definition">
+  <w:style w:customStyle="1" w:styleId="Definition" w:type="paragraph">
     <w:name w:val="Definition"/>
     <w:basedOn w:val="Normal"/>
   </w:style>
-  <w:style w:type="paragraph" w:styleId="Caption">
+  <w:style w:styleId="Caption" w:type="paragraph">
     <w:name w:val="Caption"/>
     <w:basedOn w:val="Normal"/>
     <w:link w:val="BodyTextChar"/>
     <w:pPr>
-      <w:spacing w:before="0" w:after="120"/>
+      <w:spacing w:after="120" w:before="0"/>
     </w:pPr>
     <w:rPr>
       <w:i/>
     </w:rPr>
   </w:style>
-  <w:style w:type="paragraph" w:customStyle="1" w:styleId="TableCaption">
+  <w:style w:customStyle="1" w:styleId="TableCaption" w:type="paragraph">
     <w:name w:val="Table Caption"/>
     <w:basedOn w:val="Caption"/>
     <w:pPr>
       <w:keepNext/>
     </w:pPr>
   </w:style>
-  <w:style w:type="paragraph" w:customStyle="1" w:styleId="ImageCaption">
+  <w:style w:customStyle="1" w:styleId="ImageCaption" w:type="paragraph">
     <w:name w:val="Image Caption"/>
     <w:basedOn w:val="Caption"/>
   </w:style>
-  <w:style w:type="paragraph" w:customStyle="1" w:styleId="Figure">
+  <w:style w:customStyle="1" w:styleId="Figure" w:type="paragraph">
     <w:name w:val="Figure"/>
     <w:basedOn w:val="Normal"/>
   </w:style>
-  <w:style w:type="paragraph" w:customStyle="1" w:styleId="CaptionedFigure">
+  <w:style w:customStyle="1" w:styleId="CaptionedFigure" w:type="paragraph">
     <w:name w:val="Captioned Figure"/>
     <w:basedOn w:val="Figure"/>
     <w:pPr>
       <w:keepNext/>
     </w:pPr>
   </w:style>
-  <w:style w:type="character" w:customStyle="1" w:styleId="BodyTextChar">
+  <w:style w:customStyle="1" w:styleId="BodyTextChar" w:type="character">
     <w:name w:val="Body Text Char"/>
     <w:basedOn w:val="DefaultParagraphFont"/>
     <w:link w:val="BodyText"/>
   </w:style>
-  <w:style w:type="character" w:customStyle="1" w:styleId="VerbatimChar">
+  <w:style w:customStyle="1" w:styleId="VerbatimChar" w:type="character">
     <w:name w:val="Verbatim Char"/>
     <w:basedOn w:val="BodyTextChar"/>
     <w:rPr>
-      <w:rFonts w:ascii="Consolas" w:hAnsi="Consolas" w:eastAsia="Consolas" w:cs="Consolas"/>
+      <w:rFonts w:ascii="Consolas" w:cs="Consolas" w:eastAsia="Consolas" w:hAnsi="Consolas"/>
       <w:sz w:val="14"/>
       <w:szCs w:val="14"/>
     </w:rPr>
   </w:style>
-  <w:style w:type="character" w:customStyle="1" w:styleId="SectionNumber">
+  <w:style w:customStyle="1" w:styleId="SectionNumber" w:type="character">
     <w:name w:val="Section Number"/>
     <w:basedOn w:val="BodyTextChar"/>
   </w:style>
-  <w:style w:type="character" w:styleId="FootnoteReference">
+  <w:style w:styleId="FootnoteReference" w:type="character">
     <w:name w:val="Footnote Reference"/>
     <w:basedOn w:val="BodyTextChar"/>
     <w:rPr>
       <w:vertAlign w:val="superscript"/>
     </w:rPr>
   </w:style>
-  <w:style w:type="character" w:styleId="Hyperlink">
+  <w:style w:styleId="Hyperlink" w:type="character">
     <w:name w:val="Hyperlink"/>
     <w:basedOn w:val="BodyTextChar"/>
     <w:rPr>
@@ -1286,7 +2073,7 @@
       <w:u w:val="single"/>
     </w:rPr>
   </w:style>
-  <w:style w:type="paragraph" w:styleId="TOCHeading">
+  <w:style w:styleId="TOCHeading" w:type="paragraph">
     <w:name w:val="TOC Heading"/>
     <w:basedOn w:val="Heading1"/>
     <w:next w:val="BodyText"/>
@@ -1298,23 +2085,23 @@
       <w:outlineLvl w:val="9"/>
     </w:pPr>
     <w:rPr>
-      <w:rFonts w:asciiTheme="majorHAnsi" w:eastAsiaTheme="majorEastAsia" w:hAnsiTheme="majorHAnsi" w:cstheme="majorBidi"/>
+      <w:rFonts w:asciiTheme="majorHAnsi" w:cstheme="majorBidi" w:eastAsiaTheme="majorEastAsia" w:hAnsiTheme="majorHAnsi"/>
       <w:b w:val="0"/>
       <w:bCs w:val="0"/>
-      <w:color w:val="365F91" w:themeColor="accent1" w:themeShade="BF"/>
-    </w:rPr>
-  </w:style>
-  <w:style w:type="paragraph" w:customStyle="1" w:styleId="CoverMark">
+      <w:color w:themeColor="accent1" w:themeShade="BF" w:val="365F91"/>
+    </w:rPr>
+  </w:style>
+  <w:style w:customStyle="1" w:styleId="CoverMark" w:type="paragraph">
     <w:name w:val="Cover Mark"/>
     <w:basedOn w:val="Normal"/>
     <w:qFormat/>
     <w:pPr>
       <w:jc w:val="center"/>
-      <w:spacing w:before="2400" w:after="360"/>
+      <w:spacing w:after="360" w:before="2400"/>
     </w:pPr>
     <w:rPr/>
   </w:style>
-  <w:style w:type="paragraph" w:customStyle="1" w:styleId="CoverTitle">
+  <w:style w:customStyle="1" w:styleId="CoverTitle" w:type="paragraph">
     <w:name w:val="Cover Title"/>
     <w:basedOn w:val="Normal"/>
     <w:qFormat/>
@@ -1323,7 +2110,7 @@
       <w:spacing w:after="240"/>
     </w:pPr>
     <w:rPr>
-      <w:rFonts w:ascii="Montserrat" w:hAnsi="Montserrat" w:eastAsia="Montserrat" w:cs="Montserrat"/>
+      <w:rFonts w:ascii="Montserrat" w:cs="Montserrat" w:eastAsia="Montserrat" w:hAnsi="Montserrat"/>
       <w:b/>
       <w:bCs/>
       <w:color w:val="1356CF"/>
@@ -1331,7 +2118,7 @@
       <w:szCs w:val="56"/>
     </w:rPr>
   </w:style>
-  <w:style w:type="paragraph" w:customStyle="1" w:styleId="CoverSubtitle">
+  <w:style w:customStyle="1" w:styleId="CoverSubtitle" w:type="paragraph">
     <w:name w:val="Cover Subtitle"/>
     <w:basedOn w:val="Normal"/>
     <w:qFormat/>
@@ -1345,7 +2132,7 @@
       <w:szCs w:val="24"/>
     </w:rPr>
   </w:style>
-  <w:style w:type="paragraph" w:customStyle="1" w:styleId="CoverNote">
+  <w:style w:customStyle="1" w:styleId="CoverNote" w:type="paragraph">
     <w:name w:val="Cover Note"/>
     <w:basedOn w:val="Normal"/>
     <w:qFormat/>
@@ -1359,25 +2146,259 @@
       <w:szCs w:val="17"/>
     </w:rPr>
   </w:style>
-  <w:style w:type="paragraph" w:customStyle="1" w:styleId="FrontHeading">
+  <w:style w:customStyle="1" w:styleId="FrontHeading" w:type="paragraph">
     <w:name w:val="Front Heading"/>
     <w:basedOn w:val="Normal"/>
     <w:qFormat/>
     <w:pPr>
       <w:keepNext/>
-      <w:spacing w:before="240" w:after="120"/>
+      <w:spacing w:after="120" w:before="240"/>
       <w:pBdr>
-        <w:bottom w:val="single" w:sz="8" w:space="4" w:color="1356CF"/>
+        <w:bottom w:color="1356CF" w:space="4" w:sz="8" w:val="single"/>
       </w:pBdr>
     </w:pPr>
     <w:rPr>
-      <w:rFonts w:ascii="Montserrat" w:hAnsi="Montserrat" w:eastAsia="Montserrat" w:cs="Montserrat"/>
+      <w:rFonts w:ascii="Montserrat" w:cs="Montserrat" w:eastAsia="Montserrat" w:hAnsi="Montserrat"/>
       <w:b/>
       <w:bCs/>
       <w:color w:val="1356CF"/>
       <w:sz w:val="28"/>
       <w:szCs w:val="28"/>
     </w:rPr>
+  </w:style>
+  <w:style w:type="paragraph" w:customStyle="1" w:styleId="SourceCode">
+    <w:name w:val="Source Code"/>
+    <w:basedOn w:val="Normal"/>
+    <w:link w:val="VerbatimChar"/>
+    <w:pPr>
+      <w:wordWrap w:val="off"/>
+    </w:pPr>
+  </w:style>
+  <w:style w:type="character" w:customStyle="1" w:styleId="KeywordTok">
+    <w:name w:val="KeywordTok"/>
+    <w:basedOn w:val="VerbatimChar"/>
+    <w:rPr>
+      <w:b/>
+      <w:color w:val="007020"/>
+    </w:rPr>
+  </w:style>
+  <w:style w:type="character" w:customStyle="1" w:styleId="DataTypeTok">
+    <w:name w:val="DataTypeTok"/>
+    <w:basedOn w:val="VerbatimChar"/>
+    <w:rPr>
+      <w:color w:val="902000"/>
+    </w:rPr>
+  </w:style>
+  <w:style w:type="character" w:customStyle="1" w:styleId="DecValTok">
+    <w:name w:val="DecValTok"/>
+    <w:basedOn w:val="VerbatimChar"/>
+    <w:rPr>
+      <w:color w:val="40a070"/>
+    </w:rPr>
+  </w:style>
+  <w:style w:type="character" w:customStyle="1" w:styleId="BaseNTok">
+    <w:name w:val="BaseNTok"/>
+    <w:basedOn w:val="VerbatimChar"/>
+    <w:rPr>
+      <w:color w:val="40a070"/>
+    </w:rPr>
+  </w:style>
+  <w:style w:type="character" w:customStyle="1" w:styleId="FloatTok">
+    <w:name w:val="FloatTok"/>
+    <w:basedOn w:val="VerbatimChar"/>
+    <w:rPr>
+      <w:color w:val="40a070"/>
+    </w:rPr>
+  </w:style>
+  <w:style w:type="character" w:customStyle="1" w:styleId="ConstantTok">
+    <w:name w:val="ConstantTok"/>
+    <w:basedOn w:val="VerbatimChar"/>
+    <w:rPr>
+      <w:color w:val="880000"/>
+    </w:rPr>
+  </w:style>
+  <w:style w:type="character" w:customStyle="1" w:styleId="CharTok">
+    <w:name w:val="CharTok"/>
+    <w:basedOn w:val="VerbatimChar"/>
+    <w:rPr>
+      <w:color w:val="4070a0"/>
+    </w:rPr>
+  </w:style>
+  <w:style w:type="character" w:customStyle="1" w:styleId="SpecialCharTok">
+    <w:name w:val="SpecialCharTok"/>
+    <w:basedOn w:val="VerbatimChar"/>
+    <w:rPr>
+      <w:color w:val="4070a0"/>
+    </w:rPr>
+  </w:style>
+  <w:style w:type="character" w:customStyle="1" w:styleId="StringTok">
+    <w:name w:val="StringTok"/>
+    <w:basedOn w:val="VerbatimChar"/>
+    <w:rPr>
+      <w:color w:val="4070a0"/>
+    </w:rPr>
+  </w:style>
+  <w:style w:type="character" w:customStyle="1" w:styleId="VerbatimStringTok">
+    <w:name w:val="VerbatimStringTok"/>
+    <w:basedOn w:val="VerbatimChar"/>
+    <w:rPr>
+      <w:color w:val="4070a0"/>
+    </w:rPr>
+  </w:style>
+  <w:style w:type="character" w:customStyle="1" w:styleId="SpecialStringTok">
+    <w:name w:val="SpecialStringTok"/>
+    <w:basedOn w:val="VerbatimChar"/>
+    <w:rPr>
+      <w:color w:val="bb6688"/>
+    </w:rPr>
+  </w:style>
+  <w:style w:type="character" w:customStyle="1" w:styleId="ImportTok">
+    <w:name w:val="ImportTok"/>
+    <w:basedOn w:val="VerbatimChar"/>
+    <w:rPr>
+      <w:b/>
+      <w:color w:val="008000"/>
+    </w:rPr>
+  </w:style>
+  <w:style w:type="character" w:customStyle="1" w:styleId="CommentTok">
+    <w:name w:val="CommentTok"/>
+    <w:basedOn w:val="VerbatimChar"/>
+    <w:rPr>
+      <w:i/>
+      <w:color w:val="60a0b0"/>
+    </w:rPr>
+  </w:style>
+  <w:style w:type="character" w:customStyle="1" w:styleId="DocumentationTok">
+    <w:name w:val="DocumentationTok"/>
+    <w:basedOn w:val="VerbatimChar"/>
+    <w:rPr>
+      <w:i/>
+      <w:color w:val="ba2121"/>
+    </w:rPr>
+  </w:style>
+  <w:style w:type="character" w:customStyle="1" w:styleId="AnnotationTok">
+    <w:name w:val="AnnotationTok"/>
+    <w:basedOn w:val="VerbatimChar"/>
+    <w:rPr>
+      <w:b/>
+      <w:i/>
+      <w:color w:val="60a0b0"/>
+    </w:rPr>
+  </w:style>
+  <w:style w:type="character" w:customStyle="1" w:styleId="CommentVarTok">
+    <w:name w:val="CommentVarTok"/>
+    <w:basedOn w:val="VerbatimChar"/>
+    <w:rPr>
+      <w:b/>
+      <w:i/>
+      <w:color w:val="60a0b0"/>
+    </w:rPr>
+  </w:style>
+  <w:style w:type="character" w:customStyle="1" w:styleId="OtherTok">
+    <w:name w:val="OtherTok"/>
+    <w:basedOn w:val="VerbatimChar"/>
+    <w:rPr>
+      <w:color w:val="007020"/>
+    </w:rPr>
+  </w:style>
+  <w:style w:type="character" w:customStyle="1" w:styleId="FunctionTok">
+    <w:name w:val="FunctionTok"/>
+    <w:basedOn w:val="VerbatimChar"/>
+    <w:rPr>
+      <w:color w:val="06287e"/>
+    </w:rPr>
+  </w:style>
+  <w:style w:type="character" w:customStyle="1" w:styleId="VariableTok">
+    <w:name w:val="VariableTok"/>
+    <w:basedOn w:val="VerbatimChar"/>
+    <w:rPr>
+      <w:color w:val="19177c"/>
+    </w:rPr>
+  </w:style>
+  <w:style w:type="character" w:customStyle="1" w:styleId="ControlFlowTok">
+    <w:name w:val="ControlFlowTok"/>
+    <w:basedOn w:val="VerbatimChar"/>
+    <w:rPr>
+      <w:b/>
+      <w:color w:val="007020"/>
+    </w:rPr>
+  </w:style>
+  <w:style w:type="character" w:customStyle="1" w:styleId="OperatorTok">
+    <w:name w:val="OperatorTok"/>
+    <w:basedOn w:val="VerbatimChar"/>
+    <w:rPr>
+      <w:color w:val="666666"/>
+    </w:rPr>
+  </w:style>
+  <w:style w:type="character" w:customStyle="1" w:styleId="BuiltInTok">
+    <w:name w:val="BuiltInTok"/>
+    <w:basedOn w:val="VerbatimChar"/>
+    <w:rPr>
+      <w:color w:val="008000"/>
+    </w:rPr>
+  </w:style>
+  <w:style w:type="character" w:customStyle="1" w:styleId="ExtensionTok">
+    <w:name w:val="ExtensionTok"/>
+    <w:basedOn w:val="VerbatimChar"/>
+    <w:rPr/>
+  </w:style>
+  <w:style w:type="character" w:customStyle="1" w:styleId="PreprocessorTok">
+    <w:name w:val="PreprocessorTok"/>
+    <w:basedOn w:val="VerbatimChar"/>
+    <w:rPr>
+      <w:color w:val="bc7a00"/>
+    </w:rPr>
+  </w:style>
+  <w:style w:type="character" w:customStyle="1" w:styleId="AttributeTok">
+    <w:name w:val="AttributeTok"/>
+    <w:basedOn w:val="VerbatimChar"/>
+    <w:rPr>
+      <w:color w:val="7d9029"/>
+    </w:rPr>
+  </w:style>
+  <w:style w:type="character" w:customStyle="1" w:styleId="RegionMarkerTok">
+    <w:name w:val="RegionMarkerTok"/>
+    <w:basedOn w:val="VerbatimChar"/>
+    <w:rPr/>
+  </w:style>
+  <w:style w:type="character" w:customStyle="1" w:styleId="InformationTok">
+    <w:name w:val="InformationTok"/>
+    <w:basedOn w:val="VerbatimChar"/>
+    <w:rPr>
+      <w:b/>
+      <w:i/>
+      <w:color w:val="60a0b0"/>
+    </w:rPr>
+  </w:style>
+  <w:style w:type="character" w:customStyle="1" w:styleId="WarningTok">
+    <w:name w:val="WarningTok"/>
+    <w:basedOn w:val="VerbatimChar"/>
+    <w:rPr>
+      <w:b/>
+      <w:i/>
+      <w:color w:val="60a0b0"/>
+    </w:rPr>
+  </w:style>
+  <w:style w:type="character" w:customStyle="1" w:styleId="AlertTok">
+    <w:name w:val="AlertTok"/>
+    <w:basedOn w:val="VerbatimChar"/>
+    <w:rPr>
+      <w:b/>
+      <w:color w:val="ff0000"/>
+    </w:rPr>
+  </w:style>
+  <w:style w:type="character" w:customStyle="1" w:styleId="ErrorTok">
+    <w:name w:val="ErrorTok"/>
+    <w:basedOn w:val="VerbatimChar"/>
+    <w:rPr>
+      <w:b/>
+      <w:color w:val="ff0000"/>
+    </w:rPr>
+  </w:style>
+  <w:style w:type="character" w:customStyle="1" w:styleId="NormalTok">
+    <w:name w:val="NormalTok"/>
+    <w:basedOn w:val="VerbatimChar"/>
+    <w:rPr/>
   </w:style>
 </w:styles>
 </file>

</xml_diff>